<commit_message>
Speaking script: frame GEO/SEO measures together with marketing campaigns
Co-Authored-By: Claude Opus 5.5 <noreply@anthropic.com>
Claude-Session: https://claude.ai/code/session_01NMQaoUeHEbPLTJ9CdvHzwP
</commit_message>
<xml_diff>
--- a/reports/2026-10-28_GEO/Sprechskript_Leon.docx
+++ b/reports/2026-10-28_GEO/Sprechskript_Leon.docx
@@ -29,7 +29,7 @@
           <w:sz w:val="44"/>
           <w:szCs w:val="44"/>
         </w:rPr>
-        <w:t xml:space="preserve">Mehr Reichweite über Google und KI</w:t>
+        <w:t xml:space="preserve">GEO und SEO im Zusammenspiel mit unseren Kampagnen</w:t>
       </w:r>
     </w:p>
     <w:p>
@@ -43,7 +43,7 @@
           <w:sz w:val="22"/>
           <w:szCs w:val="22"/>
         </w:rPr>
-        <w:t xml:space="preserve">Sprechskript für das Gespräch mit Leon · 8 Folien · etwa 15 Minuten · Stand 28. Oktober 2026</w:t>
+        <w:t xml:space="preserve">Sprechskript für das Gespräch mit Leon · 9 Folien · etwa 18 Minuten · Stand 28. Oktober 2026</w:t>
       </w:r>
     </w:p>
     <w:p>
@@ -80,7 +80,7 @@
           <w:sz w:val="20"/>
           <w:szCs w:val="20"/>
         </w:rPr>
-        <w:t xml:space="preserve">Leon weiß am Ende, was er tun soll und warum, was du tust, was uns das bringt, und ihr habt die fünf Entscheidungen getroffen oder einen Termin dafür.</w:t>
+        <w:t xml:space="preserve">Leon weiß am Ende, was er tun soll und warum, was du tust, wie die Maßnahmen die Kampagnen tragen, was uns das bringt, und ihr habt die fünf Entscheidungen getroffen oder einen Termin dafür.</w:t>
       </w:r>
     </w:p>
     <w:p>
@@ -128,7 +128,7 @@
           <w:sz w:val="17"/>
           <w:szCs w:val="17"/>
         </w:rPr>
-        <w:t xml:space="preserve"> etwa 1 Minute · </w:t>
+        <w:t xml:space="preserve"> etwa 1,5 Minuten · </w:t>
       </w:r>
       <w:r>
         <w:rPr>
@@ -148,35 +148,49 @@
           <w:sz w:val="17"/>
           <w:szCs w:val="17"/>
         </w:rPr>
-        <w:t xml:space="preserve"> Ziel April 2027: 20 zahlende Organisationen, 3.980 € im Monat. Heute: rund 1,6 Anmeldungen von außen im Monat.</w:t>
-      </w:r>
-    </w:p>
-    <w:p>
-      <w:pPr>
-        <w:spacing w:after="120" w:line="310"/>
-      </w:pPr>
-      <w:r>
-        <w:rPr>
-          <w:rFonts w:ascii="Helvetica" w:cs="Helvetica" w:eastAsia="Helvetica" w:hAnsi="Helvetica"/>
-          <w:color w:val="1A1A1A"/>
-          <w:sz w:val="20"/>
-          <w:szCs w:val="20"/>
-        </w:rPr>
-        <w:t xml:space="preserve">Leon, du kennst die Rechnung aus dem Pricing-Bericht: Bis April brauchen wir 20 zahlende Organisationen und 3.980 € im Monat. Der Bericht sagt klar: Der Engpass ist nicht der Preis, sondern die Reichweite. Heute kommen rund 1,6 Anmeldungen im Monat von Leuten, die wir nicht kennen.</w:t>
-      </w:r>
-    </w:p>
-    <w:p>
-      <w:pPr>
-        <w:spacing w:after="120" w:line="310"/>
-      </w:pPr>
-      <w:r>
-        <w:rPr>
-          <w:rFonts w:ascii="Helvetica" w:cs="Helvetica" w:eastAsia="Helvetica" w:hAnsi="Helvetica"/>
-          <w:color w:val="1A1A1A"/>
-          <w:sz w:val="20"/>
-          <w:szCs w:val="20"/>
-        </w:rPr>
-        <w:t xml:space="preserve">Agenturen holen wir über Vorführungen. Praxen, Heilberufe und Hersteller sollen aber über die Website kommen und kostenlos prüfen. Das klappt nur, wenn sie uns finden: bei Google und in ChatGPT, Perplexity und Gemini. Genau darum geht es heute.</w:t>
+        <w:t xml:space="preserve"> Maßnahmen für Google und KI-Suche (SEO und GEO) in Verbindung mit unseren Marketing-Kampagnen. Ziel April 2027: 20 zahlende Organisationen, 3.980 € im Monat.</w:t>
+      </w:r>
+    </w:p>
+    <w:p>
+      <w:pPr>
+        <w:spacing w:after="120" w:line="310"/>
+      </w:pPr>
+      <w:r>
+        <w:rPr>
+          <w:rFonts w:ascii="Helvetica" w:cs="Helvetica" w:eastAsia="Helvetica" w:hAnsi="Helvetica"/>
+          <w:color w:val="1A1A1A"/>
+          <w:sz w:val="20"/>
+          <w:szCs w:val="20"/>
+        </w:rPr>
+        <w:t xml:space="preserve">Leon, heute geht es um die Maßnahmen für Google und die KI-Suche, also SEO und GEO, und darum, wie sie mit unseren Marketing-Kampagnen zusammenspielen. Das gehört zusammen: Eine Kampagne weckt Interesse. Wer neugierig wird, googelt danach oder fragt ChatGPT. Findet er dort nichts oder liest eine alte Geschichte, ist die Kampagne verpufft.</w:t>
+      </w:r>
+    </w:p>
+    <w:p>
+      <w:pPr>
+        <w:spacing w:after="120" w:line="310"/>
+      </w:pPr>
+      <w:r>
+        <w:rPr>
+          <w:rFonts w:ascii="Helvetica" w:cs="Helvetica" w:eastAsia="Helvetica" w:hAnsi="Helvetica"/>
+          <w:color w:val="1A1A1A"/>
+          <w:sz w:val="20"/>
+          <w:szCs w:val="20"/>
+        </w:rPr>
+        <w:t xml:space="preserve">Der Hintergrund ist der Pricing-Bericht: Bis April brauchen wir 20 zahlende Organisationen und 3.980 € im Monat. Der Engpass ist nicht der Preis, sondern die Reichweite. Heute kommen rund 1,6 Anmeldungen im Monat von Leuten, die wir nicht kennen.</w:t>
+      </w:r>
+    </w:p>
+    <w:p>
+      <w:pPr>
+        <w:spacing w:after="120" w:line="310"/>
+      </w:pPr>
+      <w:r>
+        <w:rPr>
+          <w:rFonts w:ascii="Helvetica" w:cs="Helvetica" w:eastAsia="Helvetica" w:hAnsi="Helvetica"/>
+          <w:color w:val="1A1A1A"/>
+          <w:sz w:val="20"/>
+          <w:szCs w:val="20"/>
+        </w:rPr>
+        <w:t xml:space="preserve">Agenturen holen wir über Vorführungen. Praxen, Heilberufe und Hersteller sollen über Kampagnen und die Website kommen und kostenlos prüfen. Dafür müssen sie uns finden, bei Google und in ChatGPT, Perplexity und Gemini, und überall dieselbe Geschichte lesen.</w:t>
       </w:r>
     </w:p>
     <w:p>
@@ -286,7 +300,7 @@
         <w:keepNext/>
       </w:pPr>
       <w:r>
-        <w:t xml:space="preserve">Folie 3 · Was uns das bringt</w:t>
+        <w:t xml:space="preserve">Folie 3 · Wie Suche und Kampagnen zusammenspielen</w:t>
       </w:r>
     </w:p>
     <w:p>
@@ -316,7 +330,7 @@
           <w:sz w:val="17"/>
           <w:szCs w:val="17"/>
         </w:rPr>
-        <w:t xml:space="preserve"> etwa 2 Minuten · </w:t>
+        <w:t xml:space="preserve"> etwa 2,5 Minuten · </w:t>
       </w:r>
       <w:r>
         <w:rPr>
@@ -336,63 +350,695 @@
           <w:sz w:val="17"/>
           <w:szCs w:val="17"/>
         </w:rPr>
-        <w:t xml:space="preserve"> Die Website wird zum Weg in den Gratis-Einstieg. Frage → unsere Seite → kostenlos prüfen → Paket.</w:t>
-      </w:r>
-    </w:p>
-    <w:p>
-      <w:pPr>
-        <w:spacing w:after="120" w:line="310"/>
-      </w:pPr>
-      <w:r>
-        <w:rPr>
-          <w:rFonts w:ascii="Helvetica" w:cs="Helvetica" w:eastAsia="Helvetica" w:hAnsi="Helvetica"/>
-          <w:color w:val="1A1A1A"/>
-          <w:sz w:val="20"/>
-          <w:szCs w:val="20"/>
-        </w:rPr>
-        <w:t xml:space="preserve">Der Plan macht die Website zu dem Weg, den das Pricing braucht. Jemand fragt bei Google oder ChatGPT: „Darf ich schmerzfrei schreiben?“ Er landet auf unserer Seite. Die zeigt den riskanten Satz, die Norm und den besseren Satz. Und am Ende steht: „Ihren Satz kostenlos prüfen.“ Damit ist er im Gratis-Einstieg mit drei Prüfungen im Monat. Ab da trägt das Pricing.</w:t>
-      </w:r>
-    </w:p>
-    <w:p>
-      <w:pPr>
-        <w:spacing w:after="120" w:line="310"/>
-      </w:pPr>
-      <w:r>
-        <w:rPr>
-          <w:rFonts w:ascii="Helvetica" w:cs="Helvetica" w:eastAsia="Helvetica" w:hAnsi="Helvetica"/>
-          <w:color w:val="1A1A1A"/>
-          <w:sz w:val="20"/>
-          <w:szCs w:val="20"/>
-        </w:rPr>
-        <w:t xml:space="preserve">Dazu kommt: Die Kategorie ist noch frei. Auf die Frage „Welche Alternativen gibt es zur anwaltlichen Prüfung?“ nennt heute keines der drei Systeme ein Werkzeug. Und auf die Preisfrage antworten alle nur mit Kanzleipreisen. Da wollen wir rein, bevor es jemand anderes tut.</w:t>
-      </w:r>
-    </w:p>
-    <w:p>
-      <w:pPr>
-        <w:spacing w:after="120" w:line="310"/>
-      </w:pPr>
-      <w:r>
-        <w:rPr>
-          <w:rFonts w:ascii="Helvetica" w:cs="Helvetica" w:eastAsia="Helvetica" w:hAnsi="Helvetica"/>
-          <w:color w:val="1A1A1A"/>
-          <w:sz w:val="20"/>
-          <w:szCs w:val="20"/>
-        </w:rPr>
-        <w:t xml:space="preserve">Was es kostet: vor allem unsere Zeit. Dein Teil sind etwa fünf Stunden sofort plus die Preisseite, vier Tage in den nächsten 30 Tagen und fünf Tage bis Tag 90. Geld geben wir dafür kaum aus. Die Werkzeuge sind kostenlos, Verzeichnisse wie OMR haben ein kostenloses Basis-Profil.</w:t>
-      </w:r>
-    </w:p>
-    <w:p>
-      <w:pPr>
-        <w:spacing w:after="120" w:line="310"/>
-      </w:pPr>
-      <w:r>
-        <w:rPr>
-          <w:rFonts w:ascii="Helvetica" w:cs="Helvetica" w:eastAsia="Helvetica" w:hAnsi="Helvetica"/>
-          <w:color w:val="1A1A1A"/>
-          <w:sz w:val="20"/>
-          <w:szCs w:val="20"/>
-        </w:rPr>
-        <w:t xml:space="preserve">Woran wir es messen: Nach vier Wochen fragen wir dieselben 15 Fragen und 20 Suchbegriffe noch mal ab. In 90 Tagen soll Gemini richtig sagen, wer wir sind. Wir wollen mindestens fünf fremde Quellen statt zwei, und zwei der neuen Artikel sollen in den Top 10 stehen. Und wir sehen bei jeder Anmeldung, woher sie kommt.</w:t>
+        <w:t xml:space="preserve"> Kampagne weckt Interesse → Google und KI fangen es auf → unsere Seite führt in die kostenlose Prüfung. Reihenfolge nach dem Fahrplan im Marketing-Schlüssel.</w:t>
+      </w:r>
+    </w:p>
+    <w:p>
+      <w:pPr>
+        <w:spacing w:after="120" w:line="310"/>
+      </w:pPr>
+      <w:r>
+        <w:rPr>
+          <w:rFonts w:ascii="Helvetica" w:cs="Helvetica" w:eastAsia="Helvetica" w:hAnsi="Helvetica"/>
+          <w:color w:val="1A1A1A"/>
+          <w:sz w:val="20"/>
+          <w:szCs w:val="20"/>
+        </w:rPr>
+        <w:t xml:space="preserve">Der Marketing-Schlüssel hat einen Fahrplan für die Kampagnen. Der GEO-Plan baut für jeden Schritt den Landeplatz in der Suche. Drei Dinge greifen ineinander.</w:t>
+      </w:r>
+    </w:p>
+    <w:p>
+      <w:pPr>
+        <w:spacing w:after="120" w:line="310"/>
+      </w:pPr>
+      <w:r>
+        <w:rPr>
+          <w:rFonts w:ascii="Helvetica" w:cs="Helvetica" w:eastAsia="Helvetica" w:hAnsi="Helvetica"/>
+          <w:color w:val="1A1A1A"/>
+          <w:sz w:val="20"/>
+          <w:szCs w:val="20"/>
+        </w:rPr>
+        <w:t xml:space="preserve">Erstens: Jede Kampagne braucht eine Seite, auf der sie landet. Wer unseren LinkedIn-Beitrag sieht und danach googelt, muss die passende Seite finden, in derselben Sprache.</w:t>
+      </w:r>
+    </w:p>
+    <w:p>
+      <w:pPr>
+        <w:spacing w:after="120" w:line="310"/>
+      </w:pPr>
+      <w:r>
+        <w:rPr>
+          <w:rFonts w:ascii="Helvetica" w:cs="Helvetica" w:eastAsia="Helvetica" w:hAnsi="Helvetica"/>
+          <w:color w:val="1A1A1A"/>
+          <w:sz w:val="20"/>
+          <w:szCs w:val="20"/>
+        </w:rPr>
+        <w:t xml:space="preserve">Zweitens: Jeder neue Artikel ist Rohstoff für die Kampagne. Unser Seitenformat, also riskanter Satz, Norm, besserer Satz, ist genau die LinkedIn-Serie „Ein Satz, drei Fassungen“. Wir schreiben einmal und nutzen es zweimal.</w:t>
+      </w:r>
+    </w:p>
+    <w:p>
+      <w:pPr>
+        <w:spacing w:after="120" w:line="310"/>
+      </w:pPr>
+      <w:r>
+        <w:rPr>
+          <w:rFonts w:ascii="Helvetica" w:cs="Helvetica" w:eastAsia="Helvetica" w:hAnsi="Helvetica"/>
+          <w:color w:val="1A1A1A"/>
+          <w:sz w:val="20"/>
+          <w:szCs w:val="20"/>
+        </w:rPr>
+        <w:t xml:space="preserve">Drittens: Kampagnen bringen fremde Stimmen. Wenn ein Verband, eine Fachschule oder eine Agentur unsere Kampagne aufgreift, ist das genau die Autorität von außen, die uns bei Google und in den KI-Antworten fehlt.</w:t>
+      </w:r>
+    </w:p>
+    <w:tbl>
+      <w:tblPr>
+        <w:tblW w:type="dxa" w:w="9306"/>
+        <w:tblBorders>
+          <w:top w:val="none" w:color="FFFFFF" w:sz="0"/>
+          <w:left w:val="none" w:color="FFFFFF" w:sz="0"/>
+          <w:bottom w:val="none" w:color="FFFFFF" w:sz="0"/>
+          <w:right w:val="none" w:color="FFFFFF" w:sz="0"/>
+          <w:insideH w:val="none" w:color="FFFFFF" w:sz="0"/>
+          <w:insideV w:val="none" w:color="FFFFFF" w:sz="0"/>
+        </w:tblBorders>
+      </w:tblPr>
+      <w:tblGrid>
+        <w:gridCol w:w="1675"/>
+        <w:gridCol w:w="3536"/>
+        <w:gridCol w:w="4095"/>
+      </w:tblGrid>
+      <w:tr>
+        <w:trPr>
+          <w:cantSplit/>
+          <w:tblHeader/>
+        </w:trPr>
+        <w:tc>
+          <w:tcPr>
+            <w:tcW w:type="dxa" w:w="1675"/>
+            <w:tcBorders>
+              <w:top w:val="none" w:color="FFFFFF" w:sz="0"/>
+              <w:left w:val="none" w:color="FFFFFF" w:sz="0"/>
+              <w:bottom w:val="single" w:color="444444" w:sz="8"/>
+              <w:right w:val="none" w:color="FFFFFF" w:sz="0"/>
+            </w:tcBorders>
+            <w:tcMar>
+              <w:top w:type="dxa" w:w="60"/>
+              <w:left w:type="dxa" w:w="80"/>
+              <w:bottom w:type="dxa" w:w="60"/>
+              <w:right w:type="dxa" w:w="80"/>
+            </w:tcMar>
+          </w:tcPr>
+          <w:p>
+            <w:pPr>
+              <w:spacing w:after="0" w:line="250"/>
+            </w:pPr>
+            <w:r>
+              <w:rPr>
+                <w:rFonts w:ascii="Helvetica" w:cs="Helvetica" w:eastAsia="Helvetica" w:hAnsi="Helvetica"/>
+                <w:b/>
+                <w:bCs/>
+                <w:color w:val="333333"/>
+                <w:sz w:val="15"/>
+                <w:szCs w:val="15"/>
+              </w:rPr>
+              <w:t xml:space="preserve">Fahrplan</w:t>
+            </w:r>
+          </w:p>
+        </w:tc>
+        <w:tc>
+          <w:tcPr>
+            <w:tcW w:type="dxa" w:w="3536"/>
+            <w:tcBorders>
+              <w:top w:val="none" w:color="FFFFFF" w:sz="0"/>
+              <w:left w:val="none" w:color="FFFFFF" w:sz="0"/>
+              <w:bottom w:val="single" w:color="444444" w:sz="8"/>
+              <w:right w:val="none" w:color="FFFFFF" w:sz="0"/>
+            </w:tcBorders>
+            <w:tcMar>
+              <w:top w:type="dxa" w:w="60"/>
+              <w:left w:type="dxa" w:w="80"/>
+              <w:bottom w:type="dxa" w:w="60"/>
+              <w:right w:type="dxa" w:w="80"/>
+            </w:tcMar>
+          </w:tcPr>
+          <w:p>
+            <w:pPr>
+              <w:spacing w:after="0" w:line="250"/>
+            </w:pPr>
+            <w:r>
+              <w:rPr>
+                <w:rFonts w:ascii="Helvetica" w:cs="Helvetica" w:eastAsia="Helvetica" w:hAnsi="Helvetica"/>
+                <w:b/>
+                <w:bCs/>
+                <w:color w:val="333333"/>
+                <w:sz w:val="15"/>
+                <w:szCs w:val="15"/>
+              </w:rPr>
+              <w:t xml:space="preserve">Kampagne (Marketing-Schlüssel)</w:t>
+            </w:r>
+          </w:p>
+        </w:tc>
+        <w:tc>
+          <w:tcPr>
+            <w:tcW w:type="dxa" w:w="4095"/>
+            <w:tcBorders>
+              <w:top w:val="none" w:color="FFFFFF" w:sz="0"/>
+              <w:left w:val="none" w:color="FFFFFF" w:sz="0"/>
+              <w:bottom w:val="single" w:color="444444" w:sz="8"/>
+              <w:right w:val="none" w:color="FFFFFF" w:sz="0"/>
+            </w:tcBorders>
+            <w:tcMar>
+              <w:top w:type="dxa" w:w="60"/>
+              <w:left w:type="dxa" w:w="80"/>
+              <w:bottom w:type="dxa" w:w="60"/>
+              <w:right w:type="dxa" w:w="80"/>
+            </w:tcMar>
+          </w:tcPr>
+          <w:p>
+            <w:pPr>
+              <w:spacing w:after="0" w:line="250"/>
+            </w:pPr>
+            <w:r>
+              <w:rPr>
+                <w:rFonts w:ascii="Helvetica" w:cs="Helvetica" w:eastAsia="Helvetica" w:hAnsi="Helvetica"/>
+                <w:b/>
+                <w:bCs/>
+                <w:color w:val="333333"/>
+                <w:sz w:val="15"/>
+                <w:szCs w:val="15"/>
+              </w:rPr>
+              <w:t xml:space="preserve">Was die Suche dafür liefert</w:t>
+            </w:r>
+          </w:p>
+        </w:tc>
+      </w:tr>
+      <w:tr>
+        <w:trPr>
+          <w:cantSplit/>
+        </w:trPr>
+        <w:tc>
+          <w:tcPr>
+            <w:tcW w:type="dxa" w:w="1675"/>
+            <w:tcBorders>
+              <w:top w:val="none" w:color="FFFFFF" w:sz="0"/>
+              <w:left w:val="none" w:color="FFFFFF" w:sz="0"/>
+              <w:bottom w:val="single" w:color="D6D6D6" w:sz="4"/>
+              <w:right w:val="none" w:color="FFFFFF" w:sz="0"/>
+            </w:tcBorders>
+            <w:tcMar>
+              <w:top w:type="dxa" w:w="60"/>
+              <w:left w:type="dxa" w:w="80"/>
+              <w:bottom w:type="dxa" w:w="60"/>
+              <w:right w:type="dxa" w:w="80"/>
+            </w:tcMar>
+          </w:tcPr>
+          <w:p>
+            <w:pPr>
+              <w:spacing w:after="0" w:line="250"/>
+            </w:pPr>
+            <w:r>
+              <w:rPr>
+                <w:rFonts w:ascii="Helvetica" w:cs="Helvetica" w:eastAsia="Helvetica" w:hAnsi="Helvetica"/>
+                <w:color w:val="1A1A1A"/>
+                <w:sz w:val="15"/>
+                <w:szCs w:val="15"/>
+              </w:rPr>
+              <w:t xml:space="preserve">1 Agenturen</w:t>
+            </w:r>
+          </w:p>
+        </w:tc>
+        <w:tc>
+          <w:tcPr>
+            <w:tcW w:type="dxa" w:w="3536"/>
+            <w:tcBorders>
+              <w:top w:val="none" w:color="FFFFFF" w:sz="0"/>
+              <w:left w:val="none" w:color="FFFFFF" w:sz="0"/>
+              <w:bottom w:val="single" w:color="D6D6D6" w:sz="4"/>
+              <w:right w:val="none" w:color="FFFFFF" w:sz="0"/>
+            </w:tcBorders>
+            <w:tcMar>
+              <w:top w:type="dxa" w:w="60"/>
+              <w:left w:type="dxa" w:w="80"/>
+              <w:bottom w:type="dxa" w:w="60"/>
+              <w:right w:type="dxa" w:w="80"/>
+            </w:tcMar>
+          </w:tcPr>
+          <w:p>
+            <w:pPr>
+              <w:spacing w:after="0" w:line="250"/>
+            </w:pPr>
+            <w:r>
+              <w:rPr>
+                <w:rFonts w:ascii="Helvetica" w:cs="Helvetica" w:eastAsia="Helvetica" w:hAnsi="Helvetica"/>
+                <w:color w:val="1A1A1A"/>
+                <w:sz w:val="15"/>
+                <w:szCs w:val="15"/>
+              </w:rPr>
+              <w:t xml:space="preserve">„Ein Satz, drei Fassungen“ auf LinkedIn; „Bringen Sie zum Pitch mit, was Sie gefunden haben“</w:t>
+            </w:r>
+          </w:p>
+        </w:tc>
+        <w:tc>
+          <w:tcPr>
+            <w:tcW w:type="dxa" w:w="4095"/>
+            <w:tcBorders>
+              <w:top w:val="none" w:color="FFFFFF" w:sz="0"/>
+              <w:left w:val="none" w:color="FFFFFF" w:sz="0"/>
+              <w:bottom w:val="single" w:color="D6D6D6" w:sz="4"/>
+              <w:right w:val="none" w:color="FFFFFF" w:sz="0"/>
+            </w:tcBorders>
+            <w:tcMar>
+              <w:top w:type="dxa" w:w="60"/>
+              <w:left w:type="dxa" w:w="80"/>
+              <w:bottom w:type="dxa" w:w="60"/>
+              <w:right w:type="dxa" w:w="80"/>
+            </w:tcMar>
+          </w:tcPr>
+          <w:p>
+            <w:pPr>
+              <w:spacing w:after="0" w:line="250"/>
+            </w:pPr>
+            <w:r>
+              <w:rPr>
+                <w:rFonts w:ascii="Helvetica" w:cs="Helvetica" w:eastAsia="Helvetica" w:hAnsi="Helvetica"/>
+                <w:color w:val="1A1A1A"/>
+                <w:sz w:val="15"/>
+                <w:szCs w:val="15"/>
+              </w:rPr>
+              <w:t xml:space="preserve">Seite /agenturen; Artikel „HWG-Leitfaden für Healthcare-Agenturen“ (Platz 1); neuer Artikel zur Preisfrage; Agentur-Hinweis in jedem Artikel</w:t>
+            </w:r>
+          </w:p>
+        </w:tc>
+      </w:tr>
+      <w:tr>
+        <w:trPr>
+          <w:cantSplit/>
+        </w:trPr>
+        <w:tc>
+          <w:tcPr>
+            <w:tcW w:type="dxa" w:w="1675"/>
+            <w:tcBorders>
+              <w:top w:val="none" w:color="FFFFFF" w:sz="0"/>
+              <w:left w:val="none" w:color="FFFFFF" w:sz="0"/>
+              <w:bottom w:val="single" w:color="D6D6D6" w:sz="4"/>
+              <w:right w:val="none" w:color="FFFFFF" w:sz="0"/>
+            </w:tcBorders>
+            <w:tcMar>
+              <w:top w:type="dxa" w:w="60"/>
+              <w:left w:type="dxa" w:w="80"/>
+              <w:bottom w:type="dxa" w:w="60"/>
+              <w:right w:type="dxa" w:w="80"/>
+            </w:tcMar>
+          </w:tcPr>
+          <w:p>
+            <w:pPr>
+              <w:spacing w:after="0" w:line="250"/>
+            </w:pPr>
+            <w:r>
+              <w:rPr>
+                <w:rFonts w:ascii="Helvetica" w:cs="Helvetica" w:eastAsia="Helvetica" w:hAnsi="Helvetica"/>
+                <w:color w:val="1A1A1A"/>
+                <w:sz w:val="15"/>
+                <w:szCs w:val="15"/>
+              </w:rPr>
+              <w:t xml:space="preserve">2 Über Agenturen in die Praxen</w:t>
+            </w:r>
+          </w:p>
+        </w:tc>
+        <w:tc>
+          <w:tcPr>
+            <w:tcW w:type="dxa" w:w="3536"/>
+            <w:tcBorders>
+              <w:top w:val="none" w:color="FFFFFF" w:sz="0"/>
+              <w:left w:val="none" w:color="FFFFFF" w:sz="0"/>
+              <w:bottom w:val="single" w:color="D6D6D6" w:sz="4"/>
+              <w:right w:val="none" w:color="FFFFFF" w:sz="0"/>
+            </w:tcBorders>
+            <w:tcMar>
+              <w:top w:type="dxa" w:w="60"/>
+              <w:left w:type="dxa" w:w="80"/>
+              <w:bottom w:type="dxa" w:w="60"/>
+              <w:right w:type="dxa" w:w="80"/>
+            </w:tcMar>
+          </w:tcPr>
+          <w:p>
+            <w:pPr>
+              <w:spacing w:after="0" w:line="250"/>
+            </w:pPr>
+            <w:r>
+              <w:rPr>
+                <w:rFonts w:ascii="Helvetica" w:cs="Helvetica" w:eastAsia="Helvetica" w:hAnsi="Helvetica"/>
+                <w:color w:val="1A1A1A"/>
+                <w:sz w:val="15"/>
+                <w:szCs w:val="15"/>
+              </w:rPr>
+              <w:t xml:space="preserve">„Ihre Kunden prüfen selbst. Sie bleiben dran. 15 % für Sie.“</w:t>
+            </w:r>
+          </w:p>
+        </w:tc>
+        <w:tc>
+          <w:tcPr>
+            <w:tcW w:type="dxa" w:w="4095"/>
+            <w:tcBorders>
+              <w:top w:val="none" w:color="FFFFFF" w:sz="0"/>
+              <w:left w:val="none" w:color="FFFFFF" w:sz="0"/>
+              <w:bottom w:val="single" w:color="D6D6D6" w:sz="4"/>
+              <w:right w:val="none" w:color="FFFFFF" w:sz="0"/>
+            </w:tcBorders>
+            <w:tcMar>
+              <w:top w:type="dxa" w:w="60"/>
+              <w:left w:type="dxa" w:w="80"/>
+              <w:bottom w:type="dxa" w:w="60"/>
+              <w:right w:type="dxa" w:w="80"/>
+            </w:tcMar>
+          </w:tcPr>
+          <w:p>
+            <w:pPr>
+              <w:spacing w:after="0" w:line="250"/>
+            </w:pPr>
+            <w:r>
+              <w:rPr>
+                <w:rFonts w:ascii="Helvetica" w:cs="Helvetica" w:eastAsia="Helvetica" w:hAnsi="Helvetica"/>
+                <w:color w:val="1A1A1A"/>
+                <w:sz w:val="15"/>
+                <w:szCs w:val="15"/>
+              </w:rPr>
+              <w:t xml:space="preserve">Seiten /arztpraxen und /heilpraktiker; Fußzeile „geprüft mit PageCompliance“ wird in der Suche wiedererkannt</w:t>
+            </w:r>
+          </w:p>
+        </w:tc>
+      </w:tr>
+      <w:tr>
+        <w:trPr>
+          <w:cantSplit/>
+        </w:trPr>
+        <w:tc>
+          <w:tcPr>
+            <w:tcW w:type="dxa" w:w="1675"/>
+            <w:tcBorders>
+              <w:top w:val="none" w:color="FFFFFF" w:sz="0"/>
+              <w:left w:val="none" w:color="FFFFFF" w:sz="0"/>
+              <w:bottom w:val="single" w:color="D6D6D6" w:sz="4"/>
+              <w:right w:val="none" w:color="FFFFFF" w:sz="0"/>
+            </w:tcBorders>
+            <w:tcMar>
+              <w:top w:type="dxa" w:w="60"/>
+              <w:left w:type="dxa" w:w="80"/>
+              <w:bottom w:type="dxa" w:w="60"/>
+              <w:right w:type="dxa" w:w="80"/>
+            </w:tcMar>
+          </w:tcPr>
+          <w:p>
+            <w:pPr>
+              <w:spacing w:after="0" w:line="250"/>
+            </w:pPr>
+            <w:r>
+              <w:rPr>
+                <w:rFonts w:ascii="Helvetica" w:cs="Helvetica" w:eastAsia="Helvetica" w:hAnsi="Helvetica"/>
+                <w:color w:val="1A1A1A"/>
+                <w:sz w:val="15"/>
+                <w:szCs w:val="15"/>
+              </w:rPr>
+              <w:t xml:space="preserve">3 Heilpraktiker direkt</w:t>
+            </w:r>
+          </w:p>
+        </w:tc>
+        <w:tc>
+          <w:tcPr>
+            <w:tcW w:type="dxa" w:w="3536"/>
+            <w:tcBorders>
+              <w:top w:val="none" w:color="FFFFFF" w:sz="0"/>
+              <w:left w:val="none" w:color="FFFFFF" w:sz="0"/>
+              <w:bottom w:val="single" w:color="D6D6D6" w:sz="4"/>
+              <w:right w:val="none" w:color="FFFFFF" w:sz="0"/>
+            </w:tcBorders>
+            <w:tcMar>
+              <w:top w:type="dxa" w:w="60"/>
+              <w:left w:type="dxa" w:w="80"/>
+              <w:bottom w:type="dxa" w:w="60"/>
+              <w:right w:type="dxa" w:w="80"/>
+            </w:tcMar>
+          </w:tcPr>
+          <w:p>
+            <w:pPr>
+              <w:spacing w:after="0" w:line="250"/>
+            </w:pPr>
+            <w:r>
+              <w:rPr>
+                <w:rFonts w:ascii="Helvetica" w:cs="Helvetica" w:eastAsia="Helvetica" w:hAnsi="Helvetica"/>
+                <w:color w:val="1A1A1A"/>
+                <w:sz w:val="15"/>
+                <w:szCs w:val="15"/>
+              </w:rPr>
+              <w:t xml:space="preserve">„Der Satz, den Sie nicht mehr sagen dürfen“ über Verbände, Fachschulen, Instagram</w:t>
+            </w:r>
+          </w:p>
+        </w:tc>
+        <w:tc>
+          <w:tcPr>
+            <w:tcW w:type="dxa" w:w="4095"/>
+            <w:tcBorders>
+              <w:top w:val="none" w:color="FFFFFF" w:sz="0"/>
+              <w:left w:val="none" w:color="FFFFFF" w:sz="0"/>
+              <w:bottom w:val="single" w:color="D6D6D6" w:sz="4"/>
+              <w:right w:val="none" w:color="FFFFFF" w:sz="0"/>
+            </w:tcBorders>
+            <w:tcMar>
+              <w:top w:type="dxa" w:w="60"/>
+              <w:left w:type="dxa" w:w="80"/>
+              <w:bottom w:type="dxa" w:w="60"/>
+              <w:right w:type="dxa" w:w="80"/>
+            </w:tcMar>
+          </w:tcPr>
+          <w:p>
+            <w:pPr>
+              <w:spacing w:after="0" w:line="250"/>
+            </w:pPr>
+            <w:r>
+              <w:rPr>
+                <w:rFonts w:ascii="Helvetica" w:cs="Helvetica" w:eastAsia="Helvetica" w:hAnsi="Helvetica"/>
+                <w:color w:val="1A1A1A"/>
+                <w:sz w:val="15"/>
+                <w:szCs w:val="15"/>
+              </w:rPr>
+              <w:t xml:space="preserve">Artikel „Sind Heilversprechen strafbar?“ und „Heilversprechen: die besseren Sätze“; Umbau des Heilpraktiker-Artikels</w:t>
+            </w:r>
+          </w:p>
+        </w:tc>
+      </w:tr>
+      <w:tr>
+        <w:trPr>
+          <w:cantSplit/>
+        </w:trPr>
+        <w:tc>
+          <w:tcPr>
+            <w:tcW w:type="dxa" w:w="1675"/>
+            <w:tcBorders>
+              <w:top w:val="none" w:color="FFFFFF" w:sz="0"/>
+              <w:left w:val="none" w:color="FFFFFF" w:sz="0"/>
+              <w:bottom w:val="single" w:color="D6D6D6" w:sz="4"/>
+              <w:right w:val="none" w:color="FFFFFF" w:sz="0"/>
+            </w:tcBorders>
+            <w:tcMar>
+              <w:top w:type="dxa" w:w="60"/>
+              <w:left w:type="dxa" w:w="80"/>
+              <w:bottom w:type="dxa" w:w="60"/>
+              <w:right w:type="dxa" w:w="80"/>
+            </w:tcMar>
+          </w:tcPr>
+          <w:p>
+            <w:pPr>
+              <w:spacing w:after="0" w:line="250"/>
+            </w:pPr>
+            <w:r>
+              <w:rPr>
+                <w:rFonts w:ascii="Helvetica" w:cs="Helvetica" w:eastAsia="Helvetica" w:hAnsi="Helvetica"/>
+                <w:color w:val="1A1A1A"/>
+                <w:sz w:val="15"/>
+                <w:szCs w:val="15"/>
+              </w:rPr>
+              <w:t xml:space="preserve">4 Arztpraxen direkt</w:t>
+            </w:r>
+          </w:p>
+        </w:tc>
+        <w:tc>
+          <w:tcPr>
+            <w:tcW w:type="dxa" w:w="3536"/>
+            <w:tcBorders>
+              <w:top w:val="none" w:color="FFFFFF" w:sz="0"/>
+              <w:left w:val="none" w:color="FFFFFF" w:sz="0"/>
+              <w:bottom w:val="single" w:color="D6D6D6" w:sz="4"/>
+              <w:right w:val="none" w:color="FFFFFF" w:sz="0"/>
+            </w:tcBorders>
+            <w:tcMar>
+              <w:top w:type="dxa" w:w="60"/>
+              <w:left w:type="dxa" w:w="80"/>
+              <w:bottom w:type="dxa" w:w="60"/>
+              <w:right w:type="dxa" w:w="80"/>
+            </w:tcMar>
+          </w:tcPr>
+          <w:p>
+            <w:pPr>
+              <w:spacing w:after="0" w:line="250"/>
+            </w:pPr>
+            <w:r>
+              <w:rPr>
+                <w:rFonts w:ascii="Helvetica" w:cs="Helvetica" w:eastAsia="Helvetica" w:hAnsi="Helvetica"/>
+                <w:color w:val="1A1A1A"/>
+                <w:sz w:val="15"/>
+                <w:szCs w:val="15"/>
+              </w:rPr>
+              <w:t xml:space="preserve">„So sieht ein Patient Ihre Praxis“</w:t>
+            </w:r>
+          </w:p>
+        </w:tc>
+        <w:tc>
+          <w:tcPr>
+            <w:tcW w:type="dxa" w:w="4095"/>
+            <w:tcBorders>
+              <w:top w:val="none" w:color="FFFFFF" w:sz="0"/>
+              <w:left w:val="none" w:color="FFFFFF" w:sz="0"/>
+              <w:bottom w:val="single" w:color="D6D6D6" w:sz="4"/>
+              <w:right w:val="none" w:color="FFFFFF" w:sz="0"/>
+            </w:tcBorders>
+            <w:tcMar>
+              <w:top w:type="dxa" w:w="60"/>
+              <w:left w:type="dxa" w:w="80"/>
+              <w:bottom w:type="dxa" w:w="60"/>
+              <w:right w:type="dxa" w:w="80"/>
+            </w:tcMar>
+          </w:tcPr>
+          <w:p>
+            <w:pPr>
+              <w:spacing w:after="0" w:line="250"/>
+            </w:pPr>
+            <w:r>
+              <w:rPr>
+                <w:rFonts w:ascii="Helvetica" w:cs="Helvetica" w:eastAsia="Helvetica" w:hAnsi="Helvetica"/>
+                <w:color w:val="1A1A1A"/>
+                <w:sz w:val="15"/>
+                <w:szCs w:val="15"/>
+              </w:rPr>
+              <w:t xml:space="preserve">Artikel „Welche Werbung darf ein Arzt machen?“ und „Botox und Hyaluron“; korrigierter Vorher-Nachher-Artikel</w:t>
+            </w:r>
+          </w:p>
+        </w:tc>
+      </w:tr>
+      <w:tr>
+        <w:trPr>
+          <w:cantSplit/>
+        </w:trPr>
+        <w:tc>
+          <w:tcPr>
+            <w:tcW w:type="dxa" w:w="1675"/>
+            <w:tcBorders>
+              <w:top w:val="none" w:color="FFFFFF" w:sz="0"/>
+              <w:left w:val="none" w:color="FFFFFF" w:sz="0"/>
+              <w:bottom w:val="single" w:color="D6D6D6" w:sz="4"/>
+              <w:right w:val="none" w:color="FFFFFF" w:sz="0"/>
+            </w:tcBorders>
+            <w:tcMar>
+              <w:top w:type="dxa" w:w="60"/>
+              <w:left w:type="dxa" w:w="80"/>
+              <w:bottom w:type="dxa" w:w="60"/>
+              <w:right w:type="dxa" w:w="80"/>
+            </w:tcMar>
+          </w:tcPr>
+          <w:p>
+            <w:pPr>
+              <w:spacing w:after="0" w:line="250"/>
+            </w:pPr>
+            <w:r>
+              <w:rPr>
+                <w:rFonts w:ascii="Helvetica" w:cs="Helvetica" w:eastAsia="Helvetica" w:hAnsi="Helvetica"/>
+                <w:color w:val="1A1A1A"/>
+                <w:sz w:val="15"/>
+                <w:szCs w:val="15"/>
+              </w:rPr>
+              <w:t xml:space="preserve">5 Hersteller, nach dem Preistest mit tigovit</w:t>
+            </w:r>
+          </w:p>
+        </w:tc>
+        <w:tc>
+          <w:tcPr>
+            <w:tcW w:type="dxa" w:w="3536"/>
+            <w:tcBorders>
+              <w:top w:val="none" w:color="FFFFFF" w:sz="0"/>
+              <w:left w:val="none" w:color="FFFFFF" w:sz="0"/>
+              <w:bottom w:val="single" w:color="D6D6D6" w:sz="4"/>
+              <w:right w:val="none" w:color="FFFFFF" w:sz="0"/>
+            </w:tcBorders>
+            <w:tcMar>
+              <w:top w:type="dxa" w:w="60"/>
+              <w:left w:type="dxa" w:w="80"/>
+              <w:bottom w:type="dxa" w:w="60"/>
+              <w:right w:type="dxa" w:w="80"/>
+            </w:tcMar>
+          </w:tcPr>
+          <w:p>
+            <w:pPr>
+              <w:spacing w:after="0" w:line="250"/>
+            </w:pPr>
+            <w:r>
+              <w:rPr>
+                <w:rFonts w:ascii="Helvetica" w:cs="Helvetica" w:eastAsia="Helvetica" w:hAnsi="Helvetica"/>
+                <w:color w:val="1A1A1A"/>
+                <w:sz w:val="15"/>
+                <w:szCs w:val="15"/>
+              </w:rPr>
+              <w:t xml:space="preserve">„Eine Kapsel mehr“</w:t>
+            </w:r>
+          </w:p>
+        </w:tc>
+        <w:tc>
+          <w:tcPr>
+            <w:tcW w:type="dxa" w:w="4095"/>
+            <w:tcBorders>
+              <w:top w:val="none" w:color="FFFFFF" w:sz="0"/>
+              <w:left w:val="none" w:color="FFFFFF" w:sz="0"/>
+              <w:bottom w:val="single" w:color="D6D6D6" w:sz="4"/>
+              <w:right w:val="none" w:color="FFFFFF" w:sz="0"/>
+            </w:tcBorders>
+            <w:tcMar>
+              <w:top w:type="dxa" w:w="60"/>
+              <w:left w:type="dxa" w:w="80"/>
+              <w:bottom w:type="dxa" w:w="60"/>
+              <w:right w:type="dxa" w:w="80"/>
+            </w:tcMar>
+          </w:tcPr>
+          <w:p>
+            <w:pPr>
+              <w:spacing w:after="0" w:line="250"/>
+            </w:pPr>
+            <w:r>
+              <w:rPr>
+                <w:rFonts w:ascii="Helvetica" w:cs="Helvetica" w:eastAsia="Helvetica" w:hAnsi="Helvetica"/>
+                <w:color w:val="1A1A1A"/>
+                <w:sz w:val="15"/>
+                <w:szCs w:val="15"/>
+              </w:rPr>
+              <w:t xml:space="preserve">zusammengeführter Immunsystem-Artikel; Health-Claims-Beispiele; Seite /hersteller</w:t>
+            </w:r>
+          </w:p>
+        </w:tc>
+      </w:tr>
+    </w:tbl>
+    <w:p>
+      <w:pPr>
+        <w:spacing w:after="160"/>
+      </w:pPr>
+    </w:p>
+    <w:p>
+      <w:pPr>
+        <w:spacing w:after="120" w:line="310"/>
+      </w:pPr>
+      <w:r>
+        <w:rPr>
+          <w:rFonts w:ascii="Helvetica" w:cs="Helvetica" w:eastAsia="Helvetica" w:hAnsi="Helvetica"/>
+          <w:color w:val="1A1A1A"/>
+          <w:sz w:val="20"/>
+          <w:szCs w:val="20"/>
+        </w:rPr>
+        <w:t xml:space="preserve">Hersteller kommen erst nach dem Preistest mit tigovit, so steht es im Fahrplan. Der Fahrplan selbst ist ein Vorschlag zur Diskussion. Und bei jeder Anmeldung messen wir, ob sie über eine Kampagne, über Google oder über ein KI-System kam.</w:t>
       </w:r>
     </w:p>
     <w:p>
@@ -401,7 +1047,7 @@
         <w:keepNext/>
       </w:pPr>
       <w:r>
-        <w:t xml:space="preserve">Folie 4 · Deine Aufgaben, Leon: sofort</w:t>
+        <w:t xml:space="preserve">Folie 4 · Was uns das bringt</w:t>
       </w:r>
     </w:p>
     <w:p>
@@ -451,91 +1097,63 @@
           <w:sz w:val="17"/>
           <w:szCs w:val="17"/>
         </w:rPr>
-        <w:t xml:space="preserve"> Etwa 5 Stunden Technik plus Preisseite. L1 bis L7 und L17.</w:t>
-      </w:r>
-    </w:p>
-    <w:p>
-      <w:pPr>
-        <w:spacing w:after="120" w:line="310"/>
-      </w:pPr>
-      <w:r>
-        <w:rPr>
-          <w:rFonts w:ascii="Helvetica" w:cs="Helvetica" w:eastAsia="Helvetica" w:hAnsi="Helvetica"/>
-          <w:color w:val="1A1A1A"/>
-          <w:sz w:val="20"/>
-          <w:szCs w:val="20"/>
-        </w:rPr>
-        <w:t xml:space="preserve">Dein Teil ist die Technik und die Preise. Das meiste ist schnell gemacht, und es wirkt sofort.</w:t>
-      </w:r>
-    </w:p>
-    <w:p>
-      <w:pPr>
-        <w:spacing w:after="120" w:line="310"/>
-      </w:pPr>
-      <w:r>
-        <w:rPr>
-          <w:rFonts w:ascii="Helvetica" w:cs="Helvetica" w:eastAsia="Helvetica" w:hAnsi="Helvetica"/>
-          <w:color w:val="1A1A1A"/>
-          <w:sz w:val="20"/>
-          <w:szCs w:val="20"/>
-        </w:rPr>
-        <w:t xml:space="preserve">Erstens die robots.txt: Gemini und DuckDuckGo hereinlassen, und wenn wir uns einig sind, auch die Trainings-Crawler von OpenAI, Anthropic, Common Crawl und Apple. Warum: Sonst darf Gemini unsere Website nicht nutzen, und die Modelle kennen uns nur, wenn sie gerade im Netz suchen.</w:t>
-      </w:r>
-    </w:p>
-    <w:p>
-      <w:pPr>
-        <w:spacing w:after="120" w:line="310"/>
-      </w:pPr>
-      <w:r>
-        <w:rPr>
-          <w:rFonts w:ascii="Helvetica" w:cs="Helvetica" w:eastAsia="Helvetica" w:hAnsi="Helvetica"/>
-          <w:color w:val="1A1A1A"/>
-          <w:sz w:val="20"/>
-          <w:szCs w:val="20"/>
-        </w:rPr>
-        <w:t xml:space="preserve">Zweitens die Login- und Registrierungsseite aus dem Index nehmen. Warum: Die Login-Seite steht bei der Suche nach PageCompliance auf Platz 3, vor der Preisseite.</w:t>
-      </w:r>
-    </w:p>
-    <w:p>
-      <w:pPr>
-        <w:spacing w:after="120" w:line="310"/>
-      </w:pPr>
-      <w:r>
-        <w:rPr>
-          <w:rFonts w:ascii="Helvetica" w:cs="Helvetica" w:eastAsia="Helvetica" w:hAnsi="Helvetica"/>
-          <w:color w:val="1A1A1A"/>
-          <w:sz w:val="20"/>
-          <w:szCs w:val="20"/>
-        </w:rPr>
-        <w:t xml:space="preserve">Drittens Titles, Meta-Description und Überschriften bereinigen, also raus mit „Vorprüfung“ und „Healthcare Website Compliance Checker“. Warum: Das ist das Erste, was Google und KI lesen. Die Texte dafür bekommst du von mir.</w:t>
-      </w:r>
-    </w:p>
-    <w:p>
-      <w:pPr>
-        <w:spacing w:after="120" w:line="310"/>
-      </w:pPr>
-      <w:r>
-        <w:rPr>
-          <w:rFonts w:ascii="Helvetica" w:cs="Helvetica" w:eastAsia="Helvetica" w:hAnsi="Helvetica"/>
-          <w:color w:val="1A1A1A"/>
-          <w:sz w:val="20"/>
-          <w:szCs w:val="20"/>
-        </w:rPr>
-        <w:t xml:space="preserve">Viertens die Preisseite. Die liegt ganz bei dir, weil du die Preise verantwortest. „Anwalt ab 3.000 €“ und „Abmahnung ab 5.000 €“ müssen raus, weil wir sie nicht belegen können. Für einen Anbieter, der Werbeaussagen prüft, ist das auf der eigenen Preisseite ein echtes Risiko. Die 15 € je Text dürfen bleiben, aber klar als Rechenbeispiel.</w:t>
-      </w:r>
-    </w:p>
-    <w:p>
-      <w:pPr>
-        <w:spacing w:after="120" w:line="310"/>
-      </w:pPr>
-      <w:r>
-        <w:rPr>
-          <w:rFonts w:ascii="Helvetica" w:cs="Helvetica" w:eastAsia="Helvetica" w:hAnsi="Helvetica"/>
-          <w:color w:val="1A1A1A"/>
-          <w:sz w:val="20"/>
-          <w:szCs w:val="20"/>
-        </w:rPr>
-        <w:t xml:space="preserve">Dazu Kleinkram mit Wirkung: die llms.txt neu, die Sitemap prüfen, die Fußzeile im Blog tauschen, Search Console und Bing einrichten. Ohne die beiden Werkzeuge können wir nichts messen.</w:t>
+        <w:t xml:space="preserve"> Die Website wird zum Weg in den Gratis-Einstieg. Frage → unsere Seite → kostenlos prüfen → Paket.</w:t>
+      </w:r>
+    </w:p>
+    <w:p>
+      <w:pPr>
+        <w:spacing w:after="120" w:line="310"/>
+      </w:pPr>
+      <w:r>
+        <w:rPr>
+          <w:rFonts w:ascii="Helvetica" w:cs="Helvetica" w:eastAsia="Helvetica" w:hAnsi="Helvetica"/>
+          <w:color w:val="1A1A1A"/>
+          <w:sz w:val="20"/>
+          <w:szCs w:val="20"/>
+        </w:rPr>
+        <w:t xml:space="preserve">Der Plan macht die Website zu dem Weg, den das Pricing braucht. Jemand fragt bei Google oder ChatGPT: „Darf ich schmerzfrei schreiben?“ Er landet auf unserer Seite. Die zeigt den riskanten Satz, die Norm und den besseren Satz. Und am Ende steht: „Ihren Satz kostenlos prüfen.“ Damit ist er im Gratis-Einstieg mit drei Prüfungen im Monat. Ab da trägt das Pricing.</w:t>
+      </w:r>
+    </w:p>
+    <w:p>
+      <w:pPr>
+        <w:spacing w:after="120" w:line="310"/>
+      </w:pPr>
+      <w:r>
+        <w:rPr>
+          <w:rFonts w:ascii="Helvetica" w:cs="Helvetica" w:eastAsia="Helvetica" w:hAnsi="Helvetica"/>
+          <w:color w:val="1A1A1A"/>
+          <w:sz w:val="20"/>
+          <w:szCs w:val="20"/>
+        </w:rPr>
+        <w:t xml:space="preserve">Dazu kommt: Die Kategorie ist noch frei. Auf die Frage „Welche Alternativen gibt es zur anwaltlichen Prüfung?“ nennt heute keines der drei Systeme ein Werkzeug. Und auf die Preisfrage antworten alle nur mit Kanzleipreisen. Da wollen wir rein, bevor es jemand anderes tut.</w:t>
+      </w:r>
+    </w:p>
+    <w:p>
+      <w:pPr>
+        <w:spacing w:after="120" w:line="310"/>
+      </w:pPr>
+      <w:r>
+        <w:rPr>
+          <w:rFonts w:ascii="Helvetica" w:cs="Helvetica" w:eastAsia="Helvetica" w:hAnsi="Helvetica"/>
+          <w:color w:val="1A1A1A"/>
+          <w:sz w:val="20"/>
+          <w:szCs w:val="20"/>
+        </w:rPr>
+        <w:t xml:space="preserve">Was es kostet: vor allem unsere Zeit. Dein Teil sind etwa fünf Stunden sofort plus die Preisseite, vier Tage in den nächsten 30 Tagen und fünf Tage bis Tag 90. Geld geben wir dafür kaum aus. Die Werkzeuge sind kostenlos, Verzeichnisse wie OMR haben ein kostenloses Basis-Profil.</w:t>
+      </w:r>
+    </w:p>
+    <w:p>
+      <w:pPr>
+        <w:spacing w:after="120" w:line="310"/>
+      </w:pPr>
+      <w:r>
+        <w:rPr>
+          <w:rFonts w:ascii="Helvetica" w:cs="Helvetica" w:eastAsia="Helvetica" w:hAnsi="Helvetica"/>
+          <w:color w:val="1A1A1A"/>
+          <w:sz w:val="20"/>
+          <w:szCs w:val="20"/>
+        </w:rPr>
+        <w:t xml:space="preserve">Woran wir es messen: Nach vier Wochen fragen wir dieselben 15 Fragen und 20 Suchbegriffe noch mal ab. In 90 Tagen soll Gemini richtig sagen, wer wir sind. Wir wollen mindestens fünf fremde Quellen statt zwei, und zwei der neuen Artikel sollen in den Top 10 stehen. Und wir sehen bei jeder Anmeldung, woher sie kommt.</w:t>
       </w:r>
     </w:p>
     <w:p>
@@ -544,7 +1162,7 @@
         <w:keepNext/>
       </w:pPr>
       <w:r>
-        <w:t xml:space="preserve">Folie 5 · Deine Aufgaben, Leon: 30 und 90 Tage</w:t>
+        <w:t xml:space="preserve">Folie 5 · Deine Aufgaben, Leon: sofort</w:t>
       </w:r>
     </w:p>
     <w:p>
@@ -574,7 +1192,7 @@
           <w:sz w:val="17"/>
           <w:szCs w:val="17"/>
         </w:rPr>
-        <w:t xml:space="preserve"> etwa 1,5 Minuten · </w:t>
+        <w:t xml:space="preserve"> etwa 2 Minuten · </w:t>
       </w:r>
       <w:r>
         <w:rPr>
@@ -594,49 +1212,91 @@
           <w:sz w:val="17"/>
           <w:szCs w:val="17"/>
         </w:rPr>
-        <w:t xml:space="preserve"> 30 Tage: Firmen-Markup, Über uns, Blog-Vorlage, Weiterleitungen, Messung, Preis-Markup. 90 Tage: Seiten je Zielgruppe, Vergleichsseite.</w:t>
-      </w:r>
-    </w:p>
-    <w:p>
-      <w:pPr>
-        <w:spacing w:after="120" w:line="310"/>
-      </w:pPr>
-      <w:r>
-        <w:rPr>
-          <w:rFonts w:ascii="Helvetica" w:cs="Helvetica" w:eastAsia="Helvetica" w:hAnsi="Helvetica"/>
-          <w:color w:val="1A1A1A"/>
-          <w:sz w:val="20"/>
-          <w:szCs w:val="20"/>
-        </w:rPr>
-        <w:t xml:space="preserve">In den nächsten 30 Tagen machen wir aus PageCompliance eine Firma, die Maschinen erkennen. Du baust ein Firmen-Markup mit Sitz, Gründung, Registernummer und uns beiden als Gründer. Warum: Gemini holt diese Fakten heute aus Creditreform statt von uns.</w:t>
-      </w:r>
-    </w:p>
-    <w:p>
-      <w:pPr>
-        <w:spacing w:after="120" w:line="310"/>
-      </w:pPr>
-      <w:r>
-        <w:rPr>
-          <w:rFonts w:ascii="Helvetica" w:cs="Helvetica" w:eastAsia="Helvetica" w:hAnsi="Helvetica"/>
-          <w:color w:val="1A1A1A"/>
-          <w:sz w:val="20"/>
-          <w:szCs w:val="20"/>
-        </w:rPr>
-        <w:t xml:space="preserve">Dazu die Seite „Über uns“ mit meinem Faktenblock, eine Blog-Vorlage mit Datum, Autor, Aktenzeichen und internen Links, zwei Weiterleitungen, und die Messung, damit wir sehen, ob eine Anmeldung über ChatGPT kam. Ob wir dafür bei Plausible bleiben, entscheidest du. Das Preis-Markup kommt erst, wenn die neuen Preise live sind.</w:t>
-      </w:r>
-    </w:p>
-    <w:p>
-      <w:pPr>
-        <w:spacing w:after="120" w:line="310"/>
-      </w:pPr>
-      <w:r>
-        <w:rPr>
-          <w:rFonts w:ascii="Helvetica" w:cs="Helvetica" w:eastAsia="Helvetica" w:hAnsi="Helvetica"/>
-          <w:color w:val="1A1A1A"/>
-          <w:sz w:val="20"/>
-          <w:szCs w:val="20"/>
-        </w:rPr>
-        <w:t xml:space="preserve">Bis Tag 90 dann eine Seite je Zielgruppe: Agenturen, Arztpraxen, Heilpraktiker, Hersteller und die Seite „Laufende Website-Prüfung“ für den Wächter. Dazu eine Vergleichsseite nach Kategorien, ohne einen Wettbewerber anzugreifen. Warum: Bei den acht Suchen nach einem Werkzeug steht heute keine einzige Seite von uns.</w:t>
+        <w:t xml:space="preserve"> Etwa 5 Stunden Technik plus Preisseite. L1 bis L7 und L17.</w:t>
+      </w:r>
+    </w:p>
+    <w:p>
+      <w:pPr>
+        <w:spacing w:after="120" w:line="310"/>
+      </w:pPr>
+      <w:r>
+        <w:rPr>
+          <w:rFonts w:ascii="Helvetica" w:cs="Helvetica" w:eastAsia="Helvetica" w:hAnsi="Helvetica"/>
+          <w:color w:val="1A1A1A"/>
+          <w:sz w:val="20"/>
+          <w:szCs w:val="20"/>
+        </w:rPr>
+        <w:t xml:space="preserve">Dein Teil ist die Technik und die Preise. Das meiste ist schnell gemacht, und es wirkt sofort.</w:t>
+      </w:r>
+    </w:p>
+    <w:p>
+      <w:pPr>
+        <w:spacing w:after="120" w:line="310"/>
+      </w:pPr>
+      <w:r>
+        <w:rPr>
+          <w:rFonts w:ascii="Helvetica" w:cs="Helvetica" w:eastAsia="Helvetica" w:hAnsi="Helvetica"/>
+          <w:color w:val="1A1A1A"/>
+          <w:sz w:val="20"/>
+          <w:szCs w:val="20"/>
+        </w:rPr>
+        <w:t xml:space="preserve">Erstens die robots.txt: Gemini und DuckDuckGo hereinlassen, und wenn wir uns einig sind, auch die Trainings-Crawler von OpenAI, Anthropic, Common Crawl und Apple. Warum: Sonst darf Gemini unsere Website nicht nutzen, und die Modelle kennen uns nur, wenn sie gerade im Netz suchen.</w:t>
+      </w:r>
+    </w:p>
+    <w:p>
+      <w:pPr>
+        <w:spacing w:after="120" w:line="310"/>
+      </w:pPr>
+      <w:r>
+        <w:rPr>
+          <w:rFonts w:ascii="Helvetica" w:cs="Helvetica" w:eastAsia="Helvetica" w:hAnsi="Helvetica"/>
+          <w:color w:val="1A1A1A"/>
+          <w:sz w:val="20"/>
+          <w:szCs w:val="20"/>
+        </w:rPr>
+        <w:t xml:space="preserve">Zweitens die Login- und Registrierungsseite aus dem Index nehmen. Warum: Die Login-Seite steht bei der Suche nach PageCompliance auf Platz 3, vor der Preisseite.</w:t>
+      </w:r>
+    </w:p>
+    <w:p>
+      <w:pPr>
+        <w:spacing w:after="120" w:line="310"/>
+      </w:pPr>
+      <w:r>
+        <w:rPr>
+          <w:rFonts w:ascii="Helvetica" w:cs="Helvetica" w:eastAsia="Helvetica" w:hAnsi="Helvetica"/>
+          <w:color w:val="1A1A1A"/>
+          <w:sz w:val="20"/>
+          <w:szCs w:val="20"/>
+        </w:rPr>
+        <w:t xml:space="preserve">Drittens Titles, Meta-Description und Überschriften bereinigen, also raus mit „Vorprüfung“ und „Healthcare Website Compliance Checker“. Warum: Das ist das Erste, was Google und KI lesen. Die Texte dafür bekommst du von mir.</w:t>
+      </w:r>
+    </w:p>
+    <w:p>
+      <w:pPr>
+        <w:spacing w:after="120" w:line="310"/>
+      </w:pPr>
+      <w:r>
+        <w:rPr>
+          <w:rFonts w:ascii="Helvetica" w:cs="Helvetica" w:eastAsia="Helvetica" w:hAnsi="Helvetica"/>
+          <w:color w:val="1A1A1A"/>
+          <w:sz w:val="20"/>
+          <w:szCs w:val="20"/>
+        </w:rPr>
+        <w:t xml:space="preserve">Viertens die Preisseite. Die liegt ganz bei dir, weil du die Preise verantwortest. „Anwalt ab 3.000 €“ und „Abmahnung ab 5.000 €“ müssen raus, weil wir sie nicht belegen können. Für einen Anbieter, der Werbeaussagen prüft, ist das auf der eigenen Preisseite ein echtes Risiko. Die 15 € je Text dürfen bleiben, aber klar als Rechenbeispiel.</w:t>
+      </w:r>
+    </w:p>
+    <w:p>
+      <w:pPr>
+        <w:spacing w:after="120" w:line="310"/>
+      </w:pPr>
+      <w:r>
+        <w:rPr>
+          <w:rFonts w:ascii="Helvetica" w:cs="Helvetica" w:eastAsia="Helvetica" w:hAnsi="Helvetica"/>
+          <w:color w:val="1A1A1A"/>
+          <w:sz w:val="20"/>
+          <w:szCs w:val="20"/>
+        </w:rPr>
+        <w:t xml:space="preserve">Dazu Kleinkram mit Wirkung: die llms.txt neu, die Sitemap prüfen, die Fußzeile im Blog tauschen, Search Console und Bing einrichten. Ohne die beiden Werkzeuge können wir nichts messen.</w:t>
       </w:r>
     </w:p>
     <w:p>
@@ -645,7 +1305,7 @@
         <w:keepNext/>
       </w:pPr>
       <w:r>
-        <w:t xml:space="preserve">Folie 6 · Meine Aufgaben</w:t>
+        <w:t xml:space="preserve">Folie 6 · Deine Aufgaben, Leon: 30 und 90 Tage</w:t>
       </w:r>
     </w:p>
     <w:p>
@@ -675,7 +1335,7 @@
           <w:sz w:val="17"/>
           <w:szCs w:val="17"/>
         </w:rPr>
-        <w:t xml:space="preserve"> etwa 2 Minuten · </w:t>
+        <w:t xml:space="preserve"> etwa 1,5 Minuten · </w:t>
       </w:r>
       <w:r>
         <w:rPr>
@@ -695,77 +1355,49 @@
           <w:sz w:val="17"/>
           <w:szCs w:val="17"/>
         </w:rPr>
-        <w:t xml:space="preserve"> Eine Stimme, richtige Inhalte, fremde Stimmen. M2 bis M14.</w:t>
-      </w:r>
-    </w:p>
-    <w:p>
-      <w:pPr>
-        <w:spacing w:after="120" w:line="310"/>
-      </w:pPr>
-      <w:r>
-        <w:rPr>
-          <w:rFonts w:ascii="Helvetica" w:cs="Helvetica" w:eastAsia="Helvetica" w:hAnsi="Helvetica"/>
-          <w:color w:val="1A1A1A"/>
-          <w:sz w:val="20"/>
-          <w:szCs w:val="20"/>
-        </w:rPr>
-        <w:t xml:space="preserve">Mein Teil löst den eigentlichen Engpass: Wir sprechen überall gleich, unsere Inhalte stimmen, und andere sprechen über uns.</w:t>
-      </w:r>
-    </w:p>
-    <w:p>
-      <w:pPr>
-        <w:spacing w:after="120" w:line="310"/>
-      </w:pPr>
-      <w:r>
-        <w:rPr>
-          <w:rFonts w:ascii="Helvetica" w:cs="Helvetica" w:eastAsia="Helvetica" w:hAnsi="Helvetica"/>
-          <w:color w:val="1A1A1A"/>
-          <w:sz w:val="20"/>
-          <w:szCs w:val="20"/>
-        </w:rPr>
-        <w:t xml:space="preserve">Sofort stelle ich LinkedIn und Munich Startup auf unsere Definition um und lasse dort FinTech und InsurTech streichen. Warum: Daher hat Gemini sehr wahrscheinlich das FinTech. Ich schreibe den Text für „Über uns“. Und ich korrigiere den Vorher-Nachher-Artikel: Der BGH hat das Verbot 2025 auf Unterspritzungen ausgeweitet, das fehlt bei uns. Für einen Prüf-Anbieter ist so ein Fehler doppelt peinlich.</w:t>
-      </w:r>
-    </w:p>
-    <w:p>
-      <w:pPr>
-        <w:spacing w:after="120" w:line="310"/>
-      </w:pPr>
-      <w:r>
-        <w:rPr>
-          <w:rFonts w:ascii="Helvetica" w:cs="Helvetica" w:eastAsia="Helvetica" w:hAnsi="Helvetica"/>
-          <w:color w:val="1A1A1A"/>
-          <w:sz w:val="20"/>
-          <w:szCs w:val="20"/>
-        </w:rPr>
-        <w:t xml:space="preserve">In den nächsten 30 Tagen schreibe ich die Texte für die Startseite, baue zwei alte Artikel um und schreibe vier neue. Die vier beantworten Fragen, die Leute nachweislich stellen, zum Beispiel „Sind Heilversprechen strafbar?“. Das ist die häufigste Frage im ganzen Audit, und wir haben keinen Artikel dazu. Jeder Artikel bekommt einen LinkedIn-Beitrag. Und ich lege uns bei OMR Reviews, Crunchbase und G2 an, mit echten Bewertungen von unseren Kunden.</w:t>
-      </w:r>
-    </w:p>
-    <w:p>
-      <w:pPr>
-        <w:spacing w:after="120" w:line="310"/>
-      </w:pPr>
-      <w:r>
-        <w:rPr>
-          <w:rFonts w:ascii="Helvetica" w:cs="Helvetica" w:eastAsia="Helvetica" w:hAnsi="Helvetica"/>
-          <w:color w:val="1A1A1A"/>
-          <w:sz w:val="20"/>
-          <w:szCs w:val="20"/>
-        </w:rPr>
-        <w:t xml:space="preserve">Eine Idee, die ich noch prüfe: Partner-Agenturen wie envyo oder pixelrobots ansprechen. Die schreiben über das Heilmittelwerbegesetz, verkaufen aber Websites, keine Prüfung. Ein Gastbeitrag bei denen bringt Links, und die Agenturen sind gleichzeitig unsere Hauptkäufer.</w:t>
-      </w:r>
-    </w:p>
-    <w:p>
-      <w:pPr>
-        <w:spacing w:after="120" w:line="310"/>
-      </w:pPr>
-      <w:r>
-        <w:rPr>
-          <w:rFonts w:ascii="Helvetica" w:cs="Helvetica" w:eastAsia="Helvetica" w:hAnsi="Helvetica"/>
-          <w:color w:val="1A1A1A"/>
-          <w:sz w:val="20"/>
-          <w:szCs w:val="20"/>
-        </w:rPr>
-        <w:t xml:space="preserve">Bis Tag 90: Text für die Vergleichsseite, die Wiederholungsmessung und eine anwaltliche Durchsicht der heiklen Formulierungen.</w:t>
+        <w:t xml:space="preserve"> 30 Tage: Firmen-Markup, Über uns, Blog-Vorlage, Weiterleitungen, Messung, Preis-Markup. 90 Tage: Seiten je Zielgruppe, Vergleichsseite.</w:t>
+      </w:r>
+    </w:p>
+    <w:p>
+      <w:pPr>
+        <w:spacing w:after="120" w:line="310"/>
+      </w:pPr>
+      <w:r>
+        <w:rPr>
+          <w:rFonts w:ascii="Helvetica" w:cs="Helvetica" w:eastAsia="Helvetica" w:hAnsi="Helvetica"/>
+          <w:color w:val="1A1A1A"/>
+          <w:sz w:val="20"/>
+          <w:szCs w:val="20"/>
+        </w:rPr>
+        <w:t xml:space="preserve">In den nächsten 30 Tagen machen wir aus PageCompliance eine Firma, die Maschinen erkennen. Du baust ein Firmen-Markup mit Sitz, Gründung, Registernummer und uns beiden als Gründer. Warum: Gemini holt diese Fakten heute aus Creditreform statt von uns.</w:t>
+      </w:r>
+    </w:p>
+    <w:p>
+      <w:pPr>
+        <w:spacing w:after="120" w:line="310"/>
+      </w:pPr>
+      <w:r>
+        <w:rPr>
+          <w:rFonts w:ascii="Helvetica" w:cs="Helvetica" w:eastAsia="Helvetica" w:hAnsi="Helvetica"/>
+          <w:color w:val="1A1A1A"/>
+          <w:sz w:val="20"/>
+          <w:szCs w:val="20"/>
+        </w:rPr>
+        <w:t xml:space="preserve">Dazu die Seite „Über uns“ mit meinem Faktenblock, eine Blog-Vorlage mit Datum, Autor, Aktenzeichen und internen Links, zwei Weiterleitungen, und die Messung, damit wir sehen, ob eine Anmeldung über ChatGPT kam. Ob wir dafür bei Plausible bleiben, entscheidest du. Das Preis-Markup kommt erst, wenn die neuen Preise live sind.</w:t>
+      </w:r>
+    </w:p>
+    <w:p>
+      <w:pPr>
+        <w:spacing w:after="120" w:line="310"/>
+      </w:pPr>
+      <w:r>
+        <w:rPr>
+          <w:rFonts w:ascii="Helvetica" w:cs="Helvetica" w:eastAsia="Helvetica" w:hAnsi="Helvetica"/>
+          <w:color w:val="1A1A1A"/>
+          <w:sz w:val="20"/>
+          <w:szCs w:val="20"/>
+        </w:rPr>
+        <w:t xml:space="preserve">Bis Tag 90 dann eine Seite je Zielgruppe: Agenturen, Arztpraxen, Heilpraktiker, Hersteller und die Seite „Laufende Website-Prüfung“ für den Wächter. Dazu eine Vergleichsseite nach Kategorien, ohne einen Wettbewerber anzugreifen. Warum: Bei den acht Suchen nach einem Werkzeug steht heute keine einzige Seite von uns.</w:t>
       </w:r>
     </w:p>
     <w:p>
@@ -774,7 +1406,7 @@
         <w:keepNext/>
       </w:pPr>
       <w:r>
-        <w:t xml:space="preserve">Folie 7 · Was wir heute entscheiden</w:t>
+        <w:t xml:space="preserve">Folie 7 · Meine Aufgaben</w:t>
       </w:r>
     </w:p>
     <w:p>
@@ -804,7 +1436,7 @@
           <w:sz w:val="17"/>
           <w:szCs w:val="17"/>
         </w:rPr>
-        <w:t xml:space="preserve"> etwa 3 Minuten · </w:t>
+        <w:t xml:space="preserve"> etwa 2 Minuten · </w:t>
       </w:r>
       <w:r>
         <w:rPr>
@@ -824,71 +1456,150 @@
           <w:sz w:val="17"/>
           <w:szCs w:val="17"/>
         </w:rPr>
-        <w:t xml:space="preserve"> E1 bis E5, dazu drei offene Punkte.</w:t>
-      </w:r>
-    </w:p>
-    <w:p>
-      <w:pPr>
-        <w:spacing w:after="120" w:line="310"/>
-      </w:pPr>
-      <w:r>
-        <w:rPr>
-          <w:rFonts w:ascii="Helvetica" w:cs="Helvetica" w:eastAsia="Helvetica" w:hAnsi="Helvetica"/>
-          <w:color w:val="1A1A1A"/>
-          <w:sz w:val="20"/>
-          <w:szCs w:val="20"/>
-        </w:rPr>
-        <w:t xml:space="preserve">Fünf Entscheidungen brauche ich heute von uns beiden.</w:t>
-      </w:r>
-    </w:p>
-    <w:p>
-      <w:pPr>
-        <w:spacing w:after="120" w:line="310"/>
+        <w:t xml:space="preserve"> Eine Stimme, richtige Inhalte, fremde Stimmen. M2 bis M14.</w:t>
+      </w:r>
+    </w:p>
+    <w:p>
+      <w:pPr>
+        <w:spacing w:after="120" w:line="310"/>
+      </w:pPr>
+      <w:r>
+        <w:rPr>
+          <w:rFonts w:ascii="Helvetica" w:cs="Helvetica" w:eastAsia="Helvetica" w:hAnsi="Helvetica"/>
+          <w:color w:val="1A1A1A"/>
+          <w:sz w:val="20"/>
+          <w:szCs w:val="20"/>
+        </w:rPr>
+        <w:t xml:space="preserve">Mein Teil löst den eigentlichen Engpass: Wir sprechen überall gleich, unsere Inhalte stimmen, und andere sprechen über uns.</w:t>
+      </w:r>
+    </w:p>
+    <w:p>
+      <w:pPr>
+        <w:spacing w:after="120" w:line="310"/>
+      </w:pPr>
+      <w:r>
+        <w:rPr>
+          <w:rFonts w:ascii="Helvetica" w:cs="Helvetica" w:eastAsia="Helvetica" w:hAnsi="Helvetica"/>
+          <w:color w:val="1A1A1A"/>
+          <w:sz w:val="20"/>
+          <w:szCs w:val="20"/>
+        </w:rPr>
+        <w:t xml:space="preserve">Sofort stelle ich LinkedIn und Munich Startup auf unsere Definition um und lasse dort FinTech und InsurTech streichen. Warum: Daher hat Gemini sehr wahrscheinlich das FinTech. Ich schreibe den Text für „Über uns“. Und ich korrigiere den Vorher-Nachher-Artikel: Der BGH hat das Verbot 2025 auf Unterspritzungen ausgeweitet, das fehlt bei uns. Für einen Prüf-Anbieter ist so ein Fehler doppelt peinlich.</w:t>
+      </w:r>
+    </w:p>
+    <w:p>
+      <w:pPr>
+        <w:spacing w:after="120" w:line="310"/>
+      </w:pPr>
+      <w:r>
+        <w:rPr>
+          <w:rFonts w:ascii="Helvetica" w:cs="Helvetica" w:eastAsia="Helvetica" w:hAnsi="Helvetica"/>
+          <w:color w:val="1A1A1A"/>
+          <w:sz w:val="20"/>
+          <w:szCs w:val="20"/>
+        </w:rPr>
+        <w:t xml:space="preserve">In den nächsten 30 Tagen schreibe ich die Texte für die Startseite, baue zwei alte Artikel um und schreibe vier neue. Die vier beantworten Fragen, die Leute nachweislich stellen, zum Beispiel „Sind Heilversprechen strafbar?“. Das ist die häufigste Frage im ganzen Audit, und wir haben keinen Artikel dazu. Jeder Artikel bekommt einen LinkedIn-Beitrag. Und ich lege uns bei OMR Reviews, Crunchbase und G2 an, mit echten Bewertungen von unseren Kunden.</w:t>
+      </w:r>
+    </w:p>
+    <w:p>
+      <w:pPr>
+        <w:spacing w:after="120" w:line="310"/>
+      </w:pPr>
+      <w:r>
+        <w:rPr>
+          <w:rFonts w:ascii="Helvetica" w:cs="Helvetica" w:eastAsia="Helvetica" w:hAnsi="Helvetica"/>
+          <w:color w:val="1A1A1A"/>
+          <w:sz w:val="20"/>
+          <w:szCs w:val="20"/>
+        </w:rPr>
+        <w:t xml:space="preserve">Eine Idee, die ich noch prüfe: Partner-Agenturen wie envyo oder pixelrobots ansprechen. Die schreiben über das Heilmittelwerbegesetz, verkaufen aber Websites, keine Prüfung. Ein Gastbeitrag bei denen bringt Links, und die Agenturen sind gleichzeitig unsere Hauptkäufer.</w:t>
+      </w:r>
+    </w:p>
+    <w:p>
+      <w:pPr>
+        <w:spacing w:after="120" w:line="310"/>
+      </w:pPr>
+      <w:r>
+        <w:rPr>
+          <w:rFonts w:ascii="Helvetica" w:cs="Helvetica" w:eastAsia="Helvetica" w:hAnsi="Helvetica"/>
+          <w:color w:val="1A1A1A"/>
+          <w:sz w:val="20"/>
+          <w:szCs w:val="20"/>
+        </w:rPr>
+        <w:t xml:space="preserve">Bis Tag 90: Text für die Vergleichsseite, die Wiederholungsmessung und eine anwaltliche Durchsicht der heiklen Formulierungen.</w:t>
+      </w:r>
+    </w:p>
+    <w:p>
+      <w:pPr>
+        <w:pStyle w:val="Heading2"/>
+        <w:keepNext/>
+      </w:pPr>
+      <w:r>
+        <w:t xml:space="preserve">Folie 8 · Was wir heute entscheiden</w:t>
+      </w:r>
+    </w:p>
+    <w:p>
+      <w:pPr>
+        <w:spacing w:after="100"/>
+        <w:rPr>
+          <w:color w:val="6B6B6B"/>
+          <w:sz w:val="17"/>
+          <w:szCs w:val="17"/>
+        </w:rPr>
       </w:pPr>
       <w:r>
         <w:rPr>
           <w:rFonts w:ascii="Helvetica" w:cs="Helvetica" w:eastAsia="Helvetica" w:hAnsi="Helvetica"/>
           <w:b/>
           <w:bCs/>
-          <w:color w:val="1A1A1A"/>
-          <w:sz w:val="20"/>
-          <w:szCs w:val="20"/>
-        </w:rPr>
-        <w:t xml:space="preserve">E1, Google-Extended freigeben?</w:t>
-      </w:r>
-      <w:r>
-        <w:rPr>
-          <w:rFonts w:ascii="Helvetica" w:cs="Helvetica" w:eastAsia="Helvetica" w:hAnsi="Helvetica"/>
-          <w:color w:val="1A1A1A"/>
-          <w:sz w:val="20"/>
-          <w:szCs w:val="20"/>
-        </w:rPr>
-        <w:t xml:space="preserve"> Mein Vorschlag: ja. Ohne die Freigabe nennt uns Gemini nicht. Der Preis: Google darf unsere Texte auch für das Training nutzen.</w:t>
-      </w:r>
-    </w:p>
-    <w:p>
-      <w:pPr>
-        <w:spacing w:after="120" w:line="310"/>
-      </w:pPr>
+          <w:color w:val="6B6B6B"/>
+          <w:sz w:val="17"/>
+          <w:szCs w:val="17"/>
+        </w:rPr>
+        <w:t xml:space="preserve">Dauer:</w:t>
+      </w:r>
+      <w:r>
+        <w:rPr>
+          <w:rFonts w:ascii="Helvetica" w:cs="Helvetica" w:eastAsia="Helvetica" w:hAnsi="Helvetica"/>
+          <w:color w:val="6B6B6B"/>
+          <w:sz w:val="17"/>
+          <w:szCs w:val="17"/>
+        </w:rPr>
+        <w:t xml:space="preserve"> etwa 3 Minuten · </w:t>
+      </w:r>
       <w:r>
         <w:rPr>
           <w:rFonts w:ascii="Helvetica" w:cs="Helvetica" w:eastAsia="Helvetica" w:hAnsi="Helvetica"/>
           <w:b/>
           <w:bCs/>
-          <w:color w:val="1A1A1A"/>
-          <w:sz w:val="20"/>
-          <w:szCs w:val="20"/>
-        </w:rPr>
-        <w:t xml:space="preserve">E2, welche Preise auf die Website?</w:t>
-      </w:r>
-      <w:r>
-        <w:rPr>
-          <w:rFonts w:ascii="Helvetica" w:cs="Helvetica" w:eastAsia="Helvetica" w:hAnsi="Helvetica"/>
-          <w:color w:val="1A1A1A"/>
-          <w:sz w:val="20"/>
-          <w:szCs w:val="20"/>
-        </w:rPr>
-        <w:t xml:space="preserve"> Das entscheidest du. Mein Vorschlag: Die neuen Preise gehen mit dem Upgrade live. Bis dahin fliegen die unbelegten Zahlen sofort raus, und in neue Artikel schreiben wir keine Preise.</w:t>
+          <w:color w:val="6B6B6B"/>
+          <w:sz w:val="17"/>
+          <w:szCs w:val="17"/>
+        </w:rPr>
+        <w:t xml:space="preserve">Auf der Folie:</w:t>
+      </w:r>
+      <w:r>
+        <w:rPr>
+          <w:rFonts w:ascii="Helvetica" w:cs="Helvetica" w:eastAsia="Helvetica" w:hAnsi="Helvetica"/>
+          <w:color w:val="6B6B6B"/>
+          <w:sz w:val="17"/>
+          <w:szCs w:val="17"/>
+        </w:rPr>
+        <w:t xml:space="preserve"> E1 bis E5, dazu drei offene Punkte.</w:t>
+      </w:r>
+    </w:p>
+    <w:p>
+      <w:pPr>
+        <w:spacing w:after="120" w:line="310"/>
+      </w:pPr>
+      <w:r>
+        <w:rPr>
+          <w:rFonts w:ascii="Helvetica" w:cs="Helvetica" w:eastAsia="Helvetica" w:hAnsi="Helvetica"/>
+          <w:color w:val="1A1A1A"/>
+          <w:sz w:val="20"/>
+          <w:szCs w:val="20"/>
+        </w:rPr>
+        <w:t xml:space="preserve">Fünf Entscheidungen brauche ich heute von uns beiden.</w:t>
       </w:r>
     </w:p>
     <w:p>
@@ -904,16 +1615,16 @@
           <w:sz w:val="20"/>
           <w:szCs w:val="20"/>
         </w:rPr>
-        <w:t xml:space="preserve">E3, die Zeile „Er stellt keine Rechtsberatung dar“ unter allen Artikeln?</w:t>
-      </w:r>
-      <w:r>
-        <w:rPr>
-          <w:rFonts w:ascii="Helvetica" w:cs="Helvetica" w:eastAsia="Helvetica" w:hAnsi="Helvetica"/>
-          <w:color w:val="1A1A1A"/>
-          <w:sz w:val="20"/>
-          <w:szCs w:val="20"/>
-        </w:rPr>
-        <w:t xml:space="preserve"> Vorschlag: ersetzen durch „Dieser Artikel zeigt typische Risikostellen. Den Einzelfall bewertet Ihre Kanzlei.“ So steht es auch im Leitfaden: die Formel nur in die AGB, nicht ins Marketing.</w:t>
+        <w:t xml:space="preserve">E1, Google-Extended freigeben?</w:t>
+      </w:r>
+      <w:r>
+        <w:rPr>
+          <w:rFonts w:ascii="Helvetica" w:cs="Helvetica" w:eastAsia="Helvetica" w:hAnsi="Helvetica"/>
+          <w:color w:val="1A1A1A"/>
+          <w:sz w:val="20"/>
+          <w:szCs w:val="20"/>
+        </w:rPr>
+        <w:t xml:space="preserve"> Mein Vorschlag: ja. Ohne die Freigabe nennt uns Gemini nicht. Der Preis: Google darf unsere Texte auch für das Training nutzen.</w:t>
       </w:r>
     </w:p>
     <w:p>
@@ -929,16 +1640,16 @@
           <w:sz w:val="20"/>
           <w:szCs w:val="20"/>
         </w:rPr>
-        <w:t xml:space="preserve">E4, wie heißt die Wächter-Seite?</w:t>
-      </w:r>
-      <w:r>
-        <w:rPr>
-          <w:rFonts w:ascii="Helvetica" w:cs="Helvetica" w:eastAsia="Helvetica" w:hAnsi="Helvetica"/>
-          <w:color w:val="1A1A1A"/>
-          <w:sz w:val="20"/>
-          <w:szCs w:val="20"/>
-        </w:rPr>
-        <w:t xml:space="preserve"> Vorschlag: „Laufende Website-Prüfung“, der Monatsbericht heißt „Prüfbericht“. In der App bleibt es „Wächter“. Der Name ist deutsch, passt zu „Prüfung“, verspricht keinen Schutz, und Agenturen können ihn ihren Kunden weiterberechnen.</w:t>
+        <w:t xml:space="preserve">E2, welche Preise auf die Website?</w:t>
+      </w:r>
+      <w:r>
+        <w:rPr>
+          <w:rFonts w:ascii="Helvetica" w:cs="Helvetica" w:eastAsia="Helvetica" w:hAnsi="Helvetica"/>
+          <w:color w:val="1A1A1A"/>
+          <w:sz w:val="20"/>
+          <w:szCs w:val="20"/>
+        </w:rPr>
+        <w:t xml:space="preserve"> Das entscheidest du. Mein Vorschlag: Die neuen Preise gehen mit dem Upgrade live. Bis dahin fliegen die unbelegten Zahlen sofort raus, und in neue Artikel schreiben wir keine Preise.</w:t>
       </w:r>
     </w:p>
     <w:p>
@@ -954,6 +1665,56 @@
           <w:sz w:val="20"/>
           <w:szCs w:val="20"/>
         </w:rPr>
+        <w:t xml:space="preserve">E3, die Zeile „Er stellt keine Rechtsberatung dar“ unter allen Artikeln?</w:t>
+      </w:r>
+      <w:r>
+        <w:rPr>
+          <w:rFonts w:ascii="Helvetica" w:cs="Helvetica" w:eastAsia="Helvetica" w:hAnsi="Helvetica"/>
+          <w:color w:val="1A1A1A"/>
+          <w:sz w:val="20"/>
+          <w:szCs w:val="20"/>
+        </w:rPr>
+        <w:t xml:space="preserve"> Vorschlag: ersetzen durch „Dieser Artikel zeigt typische Risikostellen. Den Einzelfall bewertet Ihre Kanzlei.“ So steht es auch im Leitfaden: die Formel nur in die AGB, nicht ins Marketing.</w:t>
+      </w:r>
+    </w:p>
+    <w:p>
+      <w:pPr>
+        <w:spacing w:after="120" w:line="310"/>
+      </w:pPr>
+      <w:r>
+        <w:rPr>
+          <w:rFonts w:ascii="Helvetica" w:cs="Helvetica" w:eastAsia="Helvetica" w:hAnsi="Helvetica"/>
+          <w:b/>
+          <w:bCs/>
+          <w:color w:val="1A1A1A"/>
+          <w:sz w:val="20"/>
+          <w:szCs w:val="20"/>
+        </w:rPr>
+        <w:t xml:space="preserve">E4, wie heißt die Wächter-Seite?</w:t>
+      </w:r>
+      <w:r>
+        <w:rPr>
+          <w:rFonts w:ascii="Helvetica" w:cs="Helvetica" w:eastAsia="Helvetica" w:hAnsi="Helvetica"/>
+          <w:color w:val="1A1A1A"/>
+          <w:sz w:val="20"/>
+          <w:szCs w:val="20"/>
+        </w:rPr>
+        <w:t xml:space="preserve"> Vorschlag: „Laufende Website-Prüfung“, der Monatsbericht heißt „Prüfbericht“. In der App bleibt es „Wächter“. Der Name ist deutsch, passt zu „Prüfung“, verspricht keinen Schutz, und Agenturen können ihn ihren Kunden weiterberechnen.</w:t>
+      </w:r>
+    </w:p>
+    <w:p>
+      <w:pPr>
+        <w:spacing w:after="120" w:line="310"/>
+      </w:pPr>
+      <w:r>
+        <w:rPr>
+          <w:rFonts w:ascii="Helvetica" w:cs="Helvetica" w:eastAsia="Helvetica" w:hAnsi="Helvetica"/>
+          <w:b/>
+          <w:bCs/>
+          <w:color w:val="1A1A1A"/>
+          <w:sz w:val="20"/>
+          <w:szCs w:val="20"/>
+        </w:rPr>
         <w:t xml:space="preserve">E5, die Sperre für die Trainings-Crawler aufheben?</w:t>
       </w:r>
       <w:r>
@@ -986,7 +1747,7 @@
         <w:keepNext/>
       </w:pPr>
       <w:r>
-        <w:t xml:space="preserve">Folie 8 · Die nächsten vier Wochen</w:t>
+        <w:t xml:space="preserve">Folie 9 · Die nächsten vier Wochen</w:t>
       </w:r>
     </w:p>
     <w:p>
@@ -1065,6 +1826,20 @@
           <w:szCs w:val="20"/>
         </w:rPr>
         <w:t xml:space="preserve">Vier Wochen nach dem Sofort-Paket messen wir zum ersten Mal nach. Dann entscheiden wir für jede Seite: halten, verlinken, umschreiben oder aufgeben.</w:t>
+      </w:r>
+    </w:p>
+    <w:p>
+      <w:pPr>
+        <w:spacing w:after="120" w:line="310"/>
+      </w:pPr>
+      <w:r>
+        <w:rPr>
+          <w:rFonts w:ascii="Helvetica" w:cs="Helvetica" w:eastAsia="Helvetica" w:hAnsi="Helvetica"/>
+          <w:color w:val="1A1A1A"/>
+          <w:sz w:val="20"/>
+          <w:szCs w:val="20"/>
+        </w:rPr>
+        <w:t xml:space="preserve">Parallel startet Schritt 1 des Fahrplans, die Kampagne an Agenturen. Bis dahin sollen die Seiten, auf denen sie landet, schon die neue Geschichte erzählen. Deshalb kommen Sofort-Paket und Preisseite zuerst.</w:t>
       </w:r>
     </w:p>
     <w:p>
@@ -1174,6 +1949,73 @@
                 <w:szCs w:val="16"/>
               </w:rPr>
               <w:t xml:space="preserve">Antwort</w:t>
+            </w:r>
+          </w:p>
+        </w:tc>
+      </w:tr>
+      <w:tr>
+        <w:trPr>
+          <w:cantSplit/>
+        </w:trPr>
+        <w:tc>
+          <w:tcPr>
+            <w:tcW w:type="dxa" w:w="2978"/>
+            <w:tcBorders>
+              <w:top w:val="none" w:color="FFFFFF" w:sz="0"/>
+              <w:left w:val="none" w:color="FFFFFF" w:sz="0"/>
+              <w:bottom w:val="single" w:color="D6D6D6" w:sz="4"/>
+              <w:right w:val="none" w:color="FFFFFF" w:sz="0"/>
+            </w:tcBorders>
+            <w:tcMar>
+              <w:top w:type="dxa" w:w="60"/>
+              <w:left w:type="dxa" w:w="80"/>
+              <w:bottom w:type="dxa" w:w="60"/>
+              <w:right w:type="dxa" w:w="80"/>
+            </w:tcMar>
+          </w:tcPr>
+          <w:p>
+            <w:pPr>
+              <w:spacing w:after="0" w:line="250"/>
+            </w:pPr>
+            <w:r>
+              <w:rPr>
+                <w:rFonts w:ascii="Helvetica" w:cs="Helvetica" w:eastAsia="Helvetica" w:hAnsi="Helvetica"/>
+                <w:color w:val="1A1A1A"/>
+                <w:sz w:val="16"/>
+                <w:szCs w:val="16"/>
+              </w:rPr>
+              <w:t xml:space="preserve">„Warum nicht erst Kampagnen und SEO später?“</w:t>
+            </w:r>
+          </w:p>
+        </w:tc>
+        <w:tc>
+          <w:tcPr>
+            <w:tcW w:type="dxa" w:w="6328"/>
+            <w:tcBorders>
+              <w:top w:val="none" w:color="FFFFFF" w:sz="0"/>
+              <w:left w:val="none" w:color="FFFFFF" w:sz="0"/>
+              <w:bottom w:val="single" w:color="D6D6D6" w:sz="4"/>
+              <w:right w:val="none" w:color="FFFFFF" w:sz="0"/>
+            </w:tcBorders>
+            <w:tcMar>
+              <w:top w:type="dxa" w:w="60"/>
+              <w:left w:type="dxa" w:w="80"/>
+              <w:bottom w:type="dxa" w:w="60"/>
+              <w:right w:type="dxa" w:w="80"/>
+            </w:tcMar>
+          </w:tcPr>
+          <w:p>
+            <w:pPr>
+              <w:spacing w:after="0" w:line="250"/>
+            </w:pPr>
+            <w:r>
+              <w:rPr>
+                <w:rFonts w:ascii="Helvetica" w:cs="Helvetica" w:eastAsia="Helvetica" w:hAnsi="Helvetica"/>
+                <w:color w:val="1A1A1A"/>
+                <w:sz w:val="16"/>
+                <w:szCs w:val="16"/>
+              </w:rPr>
+              <w:t xml:space="preserve">Weil Kampagnen ohne Landeplatz verpuffen. Wer heute nach einem Post googelt, findet „Vorprüfung“ und alte Preise. Das Sofort-Paket dauert eine Woche; danach trägt jede Kampagne doppelt.</w:t>
             </w:r>
           </w:p>
         </w:tc>

</xml_diff>

<commit_message>
Speaking script: add slide on immediate wording changes
Co-Authored-By: Claude Opus 5.5 <noreply@anthropic.com>
Claude-Session: https://claude.ai/code/session_01NMQaoUeHEbPLTJ9CdvHzwP
</commit_message>
<xml_diff>
--- a/reports/2026-10-28_GEO/Sprechskript_Leon.docx
+++ b/reports/2026-10-28_GEO/Sprechskript_Leon.docx
@@ -43,7 +43,7 @@
           <w:sz w:val="22"/>
           <w:szCs w:val="22"/>
         </w:rPr>
-        <w:t xml:space="preserve">7 Folien · etwa 10 Minuten · Stand 28. Oktober 2026</w:t>
+        <w:t xml:space="preserve">8 Folien · etwa 11 Minuten · Stand 28. Oktober 2026</w:t>
       </w:r>
     </w:p>
     <w:p>
@@ -281,7 +281,7 @@
         <w:keepNext/>
       </w:pPr>
       <w:r>
-        <w:t xml:space="preserve">Folie 4 · Was du machst</w:t>
+        <w:t xml:space="preserve">Folie 4 · Was sich an unserer Sprache sofort ändert</w:t>
       </w:r>
     </w:p>
     <w:p>
@@ -311,7 +311,7 @@
           <w:sz w:val="17"/>
           <w:szCs w:val="17"/>
         </w:rPr>
-        <w:t xml:space="preserve"> Technik und Preise. Sofort etwa 5 Stunden, dann etwa 4 Tage, dann etwa 5 Tage.  ·  etwa 2 Minuten</w:t>
+        <w:t xml:space="preserve"> Alt raus, neu rein. Überall dieselben Worte.  ·  etwa 1,5 Minuten</w:t>
       </w:r>
     </w:p>
     <w:p>
@@ -321,22 +321,11 @@
       <w:r>
         <w:rPr>
           <w:rFonts w:ascii="Helvetica" w:cs="Helvetica" w:eastAsia="Helvetica" w:hAnsi="Helvetica"/>
-          <w:b/>
-          <w:bCs/>
-          <w:color w:val="1A1A1A"/>
-          <w:sz w:val="20"/>
-          <w:szCs w:val="20"/>
-        </w:rPr>
-        <w:t xml:space="preserve">Sofort:</w:t>
-      </w:r>
-      <w:r>
-        <w:rPr>
-          <w:rFonts w:ascii="Helvetica" w:cs="Helvetica" w:eastAsia="Helvetica" w:hAnsi="Helvetica"/>
-          <w:color w:val="1A1A1A"/>
-          <w:sz w:val="20"/>
-          <w:szCs w:val="20"/>
-        </w:rPr>
-        <w:t xml:space="preserve"> Gemini und die anderen KI-Crawler hereinlassen. Die Login-Seite aus der Google-Suche nehmen. Titel und Texte im Kopf der Seiten bereinigen. Und die Preisseite: Alle Zahlen raus, die wir nicht belegen können. Für einen Prüf-Anbieter sind die ein echtes Risiko.</w:t>
+          <w:color w:val="1A1A1A"/>
+          <w:sz w:val="20"/>
+          <w:szCs w:val="20"/>
+        </w:rPr>
+        <w:t xml:space="preserve">Die KI-Systeme wiederholen, was auf unserer Website steht. Deshalb räumen wir zuerst die Sprache auf. Und Zahlen, die wir nicht belegen können, sind für einen Prüf-Anbieter ein Risiko.</w:t>
       </w:r>
     </w:p>
     <w:p>
@@ -346,62 +335,1120 @@
       <w:r>
         <w:rPr>
           <w:rFonts w:ascii="Helvetica" w:cs="Helvetica" w:eastAsia="Helvetica" w:hAnsi="Helvetica"/>
-          <w:b/>
-          <w:bCs/>
-          <w:color w:val="1A1A1A"/>
-          <w:sz w:val="20"/>
-          <w:szCs w:val="20"/>
-        </w:rPr>
-        <w:t xml:space="preserve">In 30 Tagen:</w:t>
-      </w:r>
-      <w:r>
-        <w:rPr>
-          <w:rFonts w:ascii="Helvetica" w:cs="Helvetica" w:eastAsia="Helvetica" w:hAnsi="Helvetica"/>
-          <w:color w:val="1A1A1A"/>
-          <w:sz w:val="20"/>
-          <w:szCs w:val="20"/>
-        </w:rPr>
-        <w:t xml:space="preserve"> Google sagen, wer wir sind, also Firma, Sitz, Gründer. Die Seite „Über uns“ einbauen. Die Blog-Vorlage verbessern. Und messen, woher jede Anmeldung kommt.</w:t>
-      </w:r>
-    </w:p>
-    <w:p>
-      <w:pPr>
-        <w:spacing w:after="110" w:line="310"/>
-      </w:pPr>
-      <w:r>
-        <w:rPr>
-          <w:rFonts w:ascii="Helvetica" w:cs="Helvetica" w:eastAsia="Helvetica" w:hAnsi="Helvetica"/>
-          <w:b/>
-          <w:bCs/>
-          <w:color w:val="1A1A1A"/>
-          <w:sz w:val="20"/>
-          <w:szCs w:val="20"/>
-        </w:rPr>
-        <w:t xml:space="preserve">In 90 Tagen:</w:t>
-      </w:r>
-      <w:r>
-        <w:rPr>
-          <w:rFonts w:ascii="Helvetica" w:cs="Helvetica" w:eastAsia="Helvetica" w:hAnsi="Helvetica"/>
-          <w:color w:val="1A1A1A"/>
-          <w:sz w:val="20"/>
-          <w:szCs w:val="20"/>
-        </w:rPr>
-        <w:t xml:space="preserve"> eine Seite pro Zielgruppe und eine Vergleichsseite.</w:t>
-      </w:r>
-    </w:p>
-    <w:p>
-      <w:pPr>
-        <w:spacing w:after="110" w:line="310"/>
-      </w:pPr>
-      <w:r>
-        <w:rPr>
-          <w:rFonts w:ascii="Helvetica" w:cs="Helvetica" w:eastAsia="Helvetica" w:hAnsi="Helvetica"/>
-          <w:color w:val="1A1A1A"/>
-          <w:sz w:val="20"/>
-          <w:szCs w:val="20"/>
-        </w:rPr>
-        <w:t xml:space="preserve">Alles steht mit Erklärung in deinem Blatt.</w:t>
-      </w:r>
+          <w:color w:val="1A1A1A"/>
+          <w:sz w:val="20"/>
+          <w:szCs w:val="20"/>
+        </w:rPr>
+        <w:t xml:space="preserve">Die wichtigsten Änderungen:</w:t>
+      </w:r>
+    </w:p>
+    <w:tbl>
+      <w:tblPr>
+        <w:tblW w:type="dxa" w:w="9306"/>
+        <w:tblBorders>
+          <w:top w:val="none" w:color="FFFFFF" w:sz="0"/>
+          <w:left w:val="none" w:color="FFFFFF" w:sz="0"/>
+          <w:bottom w:val="none" w:color="FFFFFF" w:sz="0"/>
+          <w:right w:val="none" w:color="FFFFFF" w:sz="0"/>
+          <w:insideH w:val="none" w:color="FFFFFF" w:sz="0"/>
+          <w:insideV w:val="none" w:color="FFFFFF" w:sz="0"/>
+        </w:tblBorders>
+      </w:tblPr>
+      <w:tblGrid>
+        <w:gridCol w:w="3722"/>
+        <w:gridCol w:w="4095"/>
+        <w:gridCol w:w="1489"/>
+      </w:tblGrid>
+      <w:tr>
+        <w:trPr>
+          <w:cantSplit/>
+          <w:tblHeader/>
+        </w:trPr>
+        <w:tc>
+          <w:tcPr>
+            <w:tcW w:type="dxa" w:w="3722"/>
+            <w:tcBorders>
+              <w:top w:val="none" w:color="FFFFFF" w:sz="0"/>
+              <w:left w:val="none" w:color="FFFFFF" w:sz="0"/>
+              <w:bottom w:val="single" w:color="444444" w:sz="8"/>
+              <w:right w:val="none" w:color="FFFFFF" w:sz="0"/>
+            </w:tcBorders>
+            <w:tcMar>
+              <w:top w:type="dxa" w:w="60"/>
+              <w:left w:type="dxa" w:w="80"/>
+              <w:bottom w:type="dxa" w:w="60"/>
+              <w:right w:type="dxa" w:w="80"/>
+            </w:tcMar>
+          </w:tcPr>
+          <w:p>
+            <w:pPr>
+              <w:spacing w:after="0" w:line="250"/>
+            </w:pPr>
+            <w:r>
+              <w:rPr>
+                <w:rFonts w:ascii="Helvetica" w:cs="Helvetica" w:eastAsia="Helvetica" w:hAnsi="Helvetica"/>
+                <w:b/>
+                <w:bCs/>
+                <w:color w:val="333333"/>
+                <w:sz w:val="15"/>
+                <w:szCs w:val="15"/>
+              </w:rPr>
+              <w:t xml:space="preserve">Alt</w:t>
+            </w:r>
+          </w:p>
+        </w:tc>
+        <w:tc>
+          <w:tcPr>
+            <w:tcW w:type="dxa" w:w="4095"/>
+            <w:tcBorders>
+              <w:top w:val="none" w:color="FFFFFF" w:sz="0"/>
+              <w:left w:val="none" w:color="FFFFFF" w:sz="0"/>
+              <w:bottom w:val="single" w:color="444444" w:sz="8"/>
+              <w:right w:val="none" w:color="FFFFFF" w:sz="0"/>
+            </w:tcBorders>
+            <w:tcMar>
+              <w:top w:type="dxa" w:w="60"/>
+              <w:left w:type="dxa" w:w="80"/>
+              <w:bottom w:type="dxa" w:w="60"/>
+              <w:right w:type="dxa" w:w="80"/>
+            </w:tcMar>
+          </w:tcPr>
+          <w:p>
+            <w:pPr>
+              <w:spacing w:after="0" w:line="250"/>
+            </w:pPr>
+            <w:r>
+              <w:rPr>
+                <w:rFonts w:ascii="Helvetica" w:cs="Helvetica" w:eastAsia="Helvetica" w:hAnsi="Helvetica"/>
+                <w:b/>
+                <w:bCs/>
+                <w:color w:val="333333"/>
+                <w:sz w:val="15"/>
+                <w:szCs w:val="15"/>
+              </w:rPr>
+              <w:t xml:space="preserve">Neu</w:t>
+            </w:r>
+          </w:p>
+        </w:tc>
+        <w:tc>
+          <w:tcPr>
+            <w:tcW w:type="dxa" w:w="1489"/>
+            <w:tcBorders>
+              <w:top w:val="none" w:color="FFFFFF" w:sz="0"/>
+              <w:left w:val="none" w:color="FFFFFF" w:sz="0"/>
+              <w:bottom w:val="single" w:color="444444" w:sz="8"/>
+              <w:right w:val="none" w:color="FFFFFF" w:sz="0"/>
+            </w:tcBorders>
+            <w:tcMar>
+              <w:top w:type="dxa" w:w="60"/>
+              <w:left w:type="dxa" w:w="80"/>
+              <w:bottom w:type="dxa" w:w="60"/>
+              <w:right w:type="dxa" w:w="80"/>
+            </w:tcMar>
+          </w:tcPr>
+          <w:p>
+            <w:pPr>
+              <w:spacing w:after="0" w:line="250"/>
+            </w:pPr>
+            <w:r>
+              <w:rPr>
+                <w:rFonts w:ascii="Helvetica" w:cs="Helvetica" w:eastAsia="Helvetica" w:hAnsi="Helvetica"/>
+                <w:b/>
+                <w:bCs/>
+                <w:color w:val="333333"/>
+                <w:sz w:val="15"/>
+                <w:szCs w:val="15"/>
+              </w:rPr>
+              <w:t xml:space="preserve">Wer</w:t>
+            </w:r>
+          </w:p>
+        </w:tc>
+      </w:tr>
+      <w:tr>
+        <w:trPr>
+          <w:cantSplit/>
+        </w:trPr>
+        <w:tc>
+          <w:tcPr>
+            <w:tcW w:type="dxa" w:w="3722"/>
+            <w:tcBorders>
+              <w:top w:val="none" w:color="FFFFFF" w:sz="0"/>
+              <w:left w:val="none" w:color="FFFFFF" w:sz="0"/>
+              <w:bottom w:val="single" w:color="D6D6D6" w:sz="4"/>
+              <w:right w:val="none" w:color="FFFFFF" w:sz="0"/>
+            </w:tcBorders>
+            <w:tcMar>
+              <w:top w:type="dxa" w:w="60"/>
+              <w:left w:type="dxa" w:w="80"/>
+              <w:bottom w:type="dxa" w:w="60"/>
+              <w:right w:type="dxa" w:w="80"/>
+            </w:tcMar>
+          </w:tcPr>
+          <w:p>
+            <w:pPr>
+              <w:spacing w:after="0" w:line="250"/>
+            </w:pPr>
+            <w:r>
+              <w:rPr>
+                <w:rFonts w:ascii="Helvetica" w:cs="Helvetica" w:eastAsia="Helvetica" w:hAnsi="Helvetica"/>
+                <w:color w:val="1A1A1A"/>
+                <w:sz w:val="15"/>
+                <w:szCs w:val="15"/>
+              </w:rPr>
+              <w:t xml:space="preserve">„Vorprüfung“, „Vorfilter“, „Healthcare Website Compliance Checker“</w:t>
+            </w:r>
+          </w:p>
+        </w:tc>
+        <w:tc>
+          <w:tcPr>
+            <w:tcW w:type="dxa" w:w="4095"/>
+            <w:tcBorders>
+              <w:top w:val="none" w:color="FFFFFF" w:sz="0"/>
+              <w:left w:val="none" w:color="FFFFFF" w:sz="0"/>
+              <w:bottom w:val="single" w:color="D6D6D6" w:sz="4"/>
+              <w:right w:val="none" w:color="FFFFFF" w:sz="0"/>
+            </w:tcBorders>
+            <w:tcMar>
+              <w:top w:type="dxa" w:w="60"/>
+              <w:left w:type="dxa" w:w="80"/>
+              <w:bottom w:type="dxa" w:w="60"/>
+              <w:right w:type="dxa" w:w="80"/>
+            </w:tcMar>
+          </w:tcPr>
+          <w:p>
+            <w:pPr>
+              <w:spacing w:after="0" w:line="250"/>
+            </w:pPr>
+            <w:r>
+              <w:rPr>
+                <w:rFonts w:ascii="Helvetica" w:cs="Helvetica" w:eastAsia="Helvetica" w:hAnsi="Helvetica"/>
+                <w:color w:val="1A1A1A"/>
+                <w:sz w:val="15"/>
+                <w:szCs w:val="15"/>
+              </w:rPr>
+              <w:t xml:space="preserve">„Prüfung“; Claim „die Prüfung für Gesundheitswerbung“</w:t>
+            </w:r>
+          </w:p>
+        </w:tc>
+        <w:tc>
+          <w:tcPr>
+            <w:tcW w:type="dxa" w:w="1489"/>
+            <w:tcBorders>
+              <w:top w:val="none" w:color="FFFFFF" w:sz="0"/>
+              <w:left w:val="none" w:color="FFFFFF" w:sz="0"/>
+              <w:bottom w:val="single" w:color="D6D6D6" w:sz="4"/>
+              <w:right w:val="none" w:color="FFFFFF" w:sz="0"/>
+            </w:tcBorders>
+            <w:tcMar>
+              <w:top w:type="dxa" w:w="60"/>
+              <w:left w:type="dxa" w:w="80"/>
+              <w:bottom w:type="dxa" w:w="60"/>
+              <w:right w:type="dxa" w:w="80"/>
+            </w:tcMar>
+          </w:tcPr>
+          <w:p>
+            <w:pPr>
+              <w:spacing w:after="0" w:line="250"/>
+            </w:pPr>
+            <w:r>
+              <w:rPr>
+                <w:rFonts w:ascii="Helvetica" w:cs="Helvetica" w:eastAsia="Helvetica" w:hAnsi="Helvetica"/>
+                <w:color w:val="1A1A1A"/>
+                <w:sz w:val="15"/>
+                <w:szCs w:val="15"/>
+              </w:rPr>
+              <w:t xml:space="preserve">Leon, Massi</w:t>
+            </w:r>
+          </w:p>
+        </w:tc>
+      </w:tr>
+      <w:tr>
+        <w:trPr>
+          <w:cantSplit/>
+        </w:trPr>
+        <w:tc>
+          <w:tcPr>
+            <w:tcW w:type="dxa" w:w="3722"/>
+            <w:tcBorders>
+              <w:top w:val="none" w:color="FFFFFF" w:sz="0"/>
+              <w:left w:val="none" w:color="FFFFFF" w:sz="0"/>
+              <w:bottom w:val="single" w:color="D6D6D6" w:sz="4"/>
+              <w:right w:val="none" w:color="FFFFFF" w:sz="0"/>
+            </w:tcBorders>
+            <w:tcMar>
+              <w:top w:type="dxa" w:w="60"/>
+              <w:left w:type="dxa" w:w="80"/>
+              <w:bottom w:type="dxa" w:w="60"/>
+              <w:right w:type="dxa" w:w="80"/>
+            </w:tcMar>
+          </w:tcPr>
+          <w:p>
+            <w:pPr>
+              <w:spacing w:after="0" w:line="250"/>
+            </w:pPr>
+            <w:r>
+              <w:rPr>
+                <w:rFonts w:ascii="Helvetica" w:cs="Helvetica" w:eastAsia="Helvetica" w:hAnsi="Helvetica"/>
+                <w:color w:val="1A1A1A"/>
+                <w:sz w:val="15"/>
+                <w:szCs w:val="15"/>
+              </w:rPr>
+              <w:t xml:space="preserve">„Anwalt ab 3.000 €“, „Abmahnung ab 5.000 €“, „1.000 geprüfte Texte“</w:t>
+            </w:r>
+          </w:p>
+        </w:tc>
+        <w:tc>
+          <w:tcPr>
+            <w:tcW w:type="dxa" w:w="4095"/>
+            <w:tcBorders>
+              <w:top w:val="none" w:color="FFFFFF" w:sz="0"/>
+              <w:left w:val="none" w:color="FFFFFF" w:sz="0"/>
+              <w:bottom w:val="single" w:color="D6D6D6" w:sz="4"/>
+              <w:right w:val="none" w:color="FFFFFF" w:sz="0"/>
+            </w:tcBorders>
+            <w:tcMar>
+              <w:top w:type="dxa" w:w="60"/>
+              <w:left w:type="dxa" w:w="80"/>
+              <w:bottom w:type="dxa" w:w="60"/>
+              <w:right w:type="dxa" w:w="80"/>
+            </w:tcMar>
+          </w:tcPr>
+          <w:p>
+            <w:pPr>
+              <w:spacing w:after="0" w:line="250"/>
+            </w:pPr>
+            <w:r>
+              <w:rPr>
+                <w:rFonts w:ascii="Helvetica" w:cs="Helvetica" w:eastAsia="Helvetica" w:hAnsi="Helvetica"/>
+                <w:color w:val="1A1A1A"/>
+                <w:sz w:val="15"/>
+                <w:szCs w:val="15"/>
+              </w:rPr>
+              <w:t xml:space="preserve">raus; „Anwalt ab 399 €“ nur mit Quelle</w:t>
+            </w:r>
+          </w:p>
+        </w:tc>
+        <w:tc>
+          <w:tcPr>
+            <w:tcW w:type="dxa" w:w="1489"/>
+            <w:tcBorders>
+              <w:top w:val="none" w:color="FFFFFF" w:sz="0"/>
+              <w:left w:val="none" w:color="FFFFFF" w:sz="0"/>
+              <w:bottom w:val="single" w:color="D6D6D6" w:sz="4"/>
+              <w:right w:val="none" w:color="FFFFFF" w:sz="0"/>
+            </w:tcBorders>
+            <w:tcMar>
+              <w:top w:type="dxa" w:w="60"/>
+              <w:left w:type="dxa" w:w="80"/>
+              <w:bottom w:type="dxa" w:w="60"/>
+              <w:right w:type="dxa" w:w="80"/>
+            </w:tcMar>
+          </w:tcPr>
+          <w:p>
+            <w:pPr>
+              <w:spacing w:after="0" w:line="250"/>
+            </w:pPr>
+            <w:r>
+              <w:rPr>
+                <w:rFonts w:ascii="Helvetica" w:cs="Helvetica" w:eastAsia="Helvetica" w:hAnsi="Helvetica"/>
+                <w:color w:val="1A1A1A"/>
+                <w:sz w:val="15"/>
+                <w:szCs w:val="15"/>
+              </w:rPr>
+              <w:t xml:space="preserve">Leon</w:t>
+            </w:r>
+          </w:p>
+        </w:tc>
+      </w:tr>
+      <w:tr>
+        <w:trPr>
+          <w:cantSplit/>
+        </w:trPr>
+        <w:tc>
+          <w:tcPr>
+            <w:tcW w:type="dxa" w:w="3722"/>
+            <w:tcBorders>
+              <w:top w:val="none" w:color="FFFFFF" w:sz="0"/>
+              <w:left w:val="none" w:color="FFFFFF" w:sz="0"/>
+              <w:bottom w:val="single" w:color="D6D6D6" w:sz="4"/>
+              <w:right w:val="none" w:color="FFFFFF" w:sz="0"/>
+            </w:tcBorders>
+            <w:tcMar>
+              <w:top w:type="dxa" w:w="60"/>
+              <w:left w:type="dxa" w:w="80"/>
+              <w:bottom w:type="dxa" w:w="60"/>
+              <w:right w:type="dxa" w:w="80"/>
+            </w:tcMar>
+          </w:tcPr>
+          <w:p>
+            <w:pPr>
+              <w:spacing w:after="0" w:line="250"/>
+            </w:pPr>
+            <w:r>
+              <w:rPr>
+                <w:rFonts w:ascii="Helvetica" w:cs="Helvetica" w:eastAsia="Helvetica" w:hAnsi="Helvetica"/>
+                <w:color w:val="1A1A1A"/>
+                <w:sz w:val="15"/>
+                <w:szCs w:val="15"/>
+              </w:rPr>
+              <w:t xml:space="preserve">„15 € je Text“</w:t>
+            </w:r>
+          </w:p>
+        </w:tc>
+        <w:tc>
+          <w:tcPr>
+            <w:tcW w:type="dxa" w:w="4095"/>
+            <w:tcBorders>
+              <w:top w:val="none" w:color="FFFFFF" w:sz="0"/>
+              <w:left w:val="none" w:color="FFFFFF" w:sz="0"/>
+              <w:bottom w:val="single" w:color="D6D6D6" w:sz="4"/>
+              <w:right w:val="none" w:color="FFFFFF" w:sz="0"/>
+            </w:tcBorders>
+            <w:tcMar>
+              <w:top w:type="dxa" w:w="60"/>
+              <w:left w:type="dxa" w:w="80"/>
+              <w:bottom w:type="dxa" w:w="60"/>
+              <w:right w:type="dxa" w:w="80"/>
+            </w:tcMar>
+          </w:tcPr>
+          <w:p>
+            <w:pPr>
+              <w:spacing w:after="0" w:line="250"/>
+            </w:pPr>
+            <w:r>
+              <w:rPr>
+                <w:rFonts w:ascii="Helvetica" w:cs="Helvetica" w:eastAsia="Helvetica" w:hAnsi="Helvetica"/>
+                <w:color w:val="1A1A1A"/>
+                <w:sz w:val="15"/>
+                <w:szCs w:val="15"/>
+              </w:rPr>
+              <w:t xml:space="preserve">bleibt, aber klar als Rechenbeispiel</w:t>
+            </w:r>
+          </w:p>
+        </w:tc>
+        <w:tc>
+          <w:tcPr>
+            <w:tcW w:type="dxa" w:w="1489"/>
+            <w:tcBorders>
+              <w:top w:val="none" w:color="FFFFFF" w:sz="0"/>
+              <w:left w:val="none" w:color="FFFFFF" w:sz="0"/>
+              <w:bottom w:val="single" w:color="D6D6D6" w:sz="4"/>
+              <w:right w:val="none" w:color="FFFFFF" w:sz="0"/>
+            </w:tcBorders>
+            <w:tcMar>
+              <w:top w:type="dxa" w:w="60"/>
+              <w:left w:type="dxa" w:w="80"/>
+              <w:bottom w:type="dxa" w:w="60"/>
+              <w:right w:type="dxa" w:w="80"/>
+            </w:tcMar>
+          </w:tcPr>
+          <w:p>
+            <w:pPr>
+              <w:spacing w:after="0" w:line="250"/>
+            </w:pPr>
+            <w:r>
+              <w:rPr>
+                <w:rFonts w:ascii="Helvetica" w:cs="Helvetica" w:eastAsia="Helvetica" w:hAnsi="Helvetica"/>
+                <w:color w:val="1A1A1A"/>
+                <w:sz w:val="15"/>
+                <w:szCs w:val="15"/>
+              </w:rPr>
+              <w:t xml:space="preserve">Leon</w:t>
+            </w:r>
+          </w:p>
+        </w:tc>
+      </w:tr>
+      <w:tr>
+        <w:trPr>
+          <w:cantSplit/>
+        </w:trPr>
+        <w:tc>
+          <w:tcPr>
+            <w:tcW w:type="dxa" w:w="3722"/>
+            <w:tcBorders>
+              <w:top w:val="none" w:color="FFFFFF" w:sz="0"/>
+              <w:left w:val="none" w:color="FFFFFF" w:sz="0"/>
+              <w:bottom w:val="single" w:color="D6D6D6" w:sz="4"/>
+              <w:right w:val="none" w:color="FFFFFF" w:sz="0"/>
+            </w:tcBorders>
+            <w:tcMar>
+              <w:top w:type="dxa" w:w="60"/>
+              <w:left w:type="dxa" w:w="80"/>
+              <w:bottom w:type="dxa" w:w="60"/>
+              <w:right w:type="dxa" w:w="80"/>
+            </w:tcMar>
+          </w:tcPr>
+          <w:p>
+            <w:pPr>
+              <w:spacing w:after="0" w:line="250"/>
+            </w:pPr>
+            <w:r>
+              <w:rPr>
+                <w:rFonts w:ascii="Helvetica" w:cs="Helvetica" w:eastAsia="Helvetica" w:hAnsi="Helvetica"/>
+                <w:color w:val="1A1A1A"/>
+                <w:sz w:val="15"/>
+                <w:szCs w:val="15"/>
+              </w:rPr>
+              <w:t xml:space="preserve">Starter, Professional</w:t>
+            </w:r>
+          </w:p>
+        </w:tc>
+        <w:tc>
+          <w:tcPr>
+            <w:tcW w:type="dxa" w:w="4095"/>
+            <w:tcBorders>
+              <w:top w:val="none" w:color="FFFFFF" w:sz="0"/>
+              <w:left w:val="none" w:color="FFFFFF" w:sz="0"/>
+              <w:bottom w:val="single" w:color="D6D6D6" w:sz="4"/>
+              <w:right w:val="none" w:color="FFFFFF" w:sz="0"/>
+            </w:tcBorders>
+            <w:tcMar>
+              <w:top w:type="dxa" w:w="60"/>
+              <w:left w:type="dxa" w:w="80"/>
+              <w:bottom w:type="dxa" w:w="60"/>
+              <w:right w:type="dxa" w:w="80"/>
+            </w:tcMar>
+          </w:tcPr>
+          <w:p>
+            <w:pPr>
+              <w:spacing w:after="0" w:line="250"/>
+            </w:pPr>
+            <w:r>
+              <w:rPr>
+                <w:rFonts w:ascii="Helvetica" w:cs="Helvetica" w:eastAsia="Helvetica" w:hAnsi="Helvetica"/>
+                <w:color w:val="1A1A1A"/>
+                <w:sz w:val="15"/>
+                <w:szCs w:val="15"/>
+              </w:rPr>
+              <w:t xml:space="preserve">Gratis, Praxis, Hersteller, Agentur, Team (mit dem Upgrade)</w:t>
+            </w:r>
+          </w:p>
+        </w:tc>
+        <w:tc>
+          <w:tcPr>
+            <w:tcW w:type="dxa" w:w="1489"/>
+            <w:tcBorders>
+              <w:top w:val="none" w:color="FFFFFF" w:sz="0"/>
+              <w:left w:val="none" w:color="FFFFFF" w:sz="0"/>
+              <w:bottom w:val="single" w:color="D6D6D6" w:sz="4"/>
+              <w:right w:val="none" w:color="FFFFFF" w:sz="0"/>
+            </w:tcBorders>
+            <w:tcMar>
+              <w:top w:type="dxa" w:w="60"/>
+              <w:left w:type="dxa" w:w="80"/>
+              <w:bottom w:type="dxa" w:w="60"/>
+              <w:right w:type="dxa" w:w="80"/>
+            </w:tcMar>
+          </w:tcPr>
+          <w:p>
+            <w:pPr>
+              <w:spacing w:after="0" w:line="250"/>
+            </w:pPr>
+            <w:r>
+              <w:rPr>
+                <w:rFonts w:ascii="Helvetica" w:cs="Helvetica" w:eastAsia="Helvetica" w:hAnsi="Helvetica"/>
+                <w:color w:val="1A1A1A"/>
+                <w:sz w:val="15"/>
+                <w:szCs w:val="15"/>
+              </w:rPr>
+              <w:t xml:space="preserve">Leon</w:t>
+            </w:r>
+          </w:p>
+        </w:tc>
+      </w:tr>
+      <w:tr>
+        <w:trPr>
+          <w:cantSplit/>
+        </w:trPr>
+        <w:tc>
+          <w:tcPr>
+            <w:tcW w:type="dxa" w:w="3722"/>
+            <w:tcBorders>
+              <w:top w:val="none" w:color="FFFFFF" w:sz="0"/>
+              <w:left w:val="none" w:color="FFFFFF" w:sz="0"/>
+              <w:bottom w:val="single" w:color="D6D6D6" w:sz="4"/>
+              <w:right w:val="none" w:color="FFFFFF" w:sz="0"/>
+            </w:tcBorders>
+            <w:tcMar>
+              <w:top w:type="dxa" w:w="60"/>
+              <w:left w:type="dxa" w:w="80"/>
+              <w:bottom w:type="dxa" w:w="60"/>
+              <w:right w:type="dxa" w:w="80"/>
+            </w:tcMar>
+          </w:tcPr>
+          <w:p>
+            <w:pPr>
+              <w:spacing w:after="0" w:line="250"/>
+            </w:pPr>
+            <w:r>
+              <w:rPr>
+                <w:rFonts w:ascii="Helvetica" w:cs="Helvetica" w:eastAsia="Helvetica" w:hAnsi="Helvetica"/>
+                <w:color w:val="1A1A1A"/>
+                <w:sz w:val="15"/>
+                <w:szCs w:val="15"/>
+              </w:rPr>
+              <w:t xml:space="preserve">„White-Label“, „Video-Audit“</w:t>
+            </w:r>
+          </w:p>
+        </w:tc>
+        <w:tc>
+          <w:tcPr>
+            <w:tcW w:type="dxa" w:w="4095"/>
+            <w:tcBorders>
+              <w:top w:val="none" w:color="FFFFFF" w:sz="0"/>
+              <w:left w:val="none" w:color="FFFFFF" w:sz="0"/>
+              <w:bottom w:val="single" w:color="D6D6D6" w:sz="4"/>
+              <w:right w:val="none" w:color="FFFFFF" w:sz="0"/>
+            </w:tcBorders>
+            <w:tcMar>
+              <w:top w:type="dxa" w:w="60"/>
+              <w:left w:type="dxa" w:w="80"/>
+              <w:bottom w:type="dxa" w:w="60"/>
+              <w:right w:type="dxa" w:w="80"/>
+            </w:tcMar>
+          </w:tcPr>
+          <w:p>
+            <w:pPr>
+              <w:spacing w:after="0" w:line="250"/>
+            </w:pPr>
+            <w:r>
+              <w:rPr>
+                <w:rFonts w:ascii="Helvetica" w:cs="Helvetica" w:eastAsia="Helvetica" w:hAnsi="Helvetica"/>
+                <w:color w:val="1A1A1A"/>
+                <w:sz w:val="15"/>
+                <w:szCs w:val="15"/>
+              </w:rPr>
+              <w:t xml:space="preserve">„In Ihrem Namen“, „Einzel-Audit“</w:t>
+            </w:r>
+          </w:p>
+        </w:tc>
+        <w:tc>
+          <w:tcPr>
+            <w:tcW w:type="dxa" w:w="1489"/>
+            <w:tcBorders>
+              <w:top w:val="none" w:color="FFFFFF" w:sz="0"/>
+              <w:left w:val="none" w:color="FFFFFF" w:sz="0"/>
+              <w:bottom w:val="single" w:color="D6D6D6" w:sz="4"/>
+              <w:right w:val="none" w:color="FFFFFF" w:sz="0"/>
+            </w:tcBorders>
+            <w:tcMar>
+              <w:top w:type="dxa" w:w="60"/>
+              <w:left w:type="dxa" w:w="80"/>
+              <w:bottom w:type="dxa" w:w="60"/>
+              <w:right w:type="dxa" w:w="80"/>
+            </w:tcMar>
+          </w:tcPr>
+          <w:p>
+            <w:pPr>
+              <w:spacing w:after="0" w:line="250"/>
+            </w:pPr>
+            <w:r>
+              <w:rPr>
+                <w:rFonts w:ascii="Helvetica" w:cs="Helvetica" w:eastAsia="Helvetica" w:hAnsi="Helvetica"/>
+                <w:color w:val="1A1A1A"/>
+                <w:sz w:val="15"/>
+                <w:szCs w:val="15"/>
+              </w:rPr>
+              <w:t xml:space="preserve">Leon</w:t>
+            </w:r>
+          </w:p>
+        </w:tc>
+      </w:tr>
+      <w:tr>
+        <w:trPr>
+          <w:cantSplit/>
+        </w:trPr>
+        <w:tc>
+          <w:tcPr>
+            <w:tcW w:type="dxa" w:w="3722"/>
+            <w:tcBorders>
+              <w:top w:val="none" w:color="FFFFFF" w:sz="0"/>
+              <w:left w:val="none" w:color="FFFFFF" w:sz="0"/>
+              <w:bottom w:val="single" w:color="D6D6D6" w:sz="4"/>
+              <w:right w:val="none" w:color="FFFFFF" w:sz="0"/>
+            </w:tcBorders>
+            <w:tcMar>
+              <w:top w:type="dxa" w:w="60"/>
+              <w:left w:type="dxa" w:w="80"/>
+              <w:bottom w:type="dxa" w:w="60"/>
+              <w:right w:type="dxa" w:w="80"/>
+            </w:tcMar>
+          </w:tcPr>
+          <w:p>
+            <w:pPr>
+              <w:spacing w:after="0" w:line="250"/>
+            </w:pPr>
+            <w:r>
+              <w:rPr>
+                <w:rFonts w:ascii="Helvetica" w:cs="Helvetica" w:eastAsia="Helvetica" w:hAnsi="Helvetica"/>
+                <w:color w:val="1A1A1A"/>
+                <w:sz w:val="15"/>
+                <w:szCs w:val="15"/>
+              </w:rPr>
+              <w:t xml:space="preserve">„Für jede Regel ein Spezialist“, „12 Paragrafen“</w:t>
+            </w:r>
+          </w:p>
+        </w:tc>
+        <w:tc>
+          <w:tcPr>
+            <w:tcW w:type="dxa" w:w="4095"/>
+            <w:tcBorders>
+              <w:top w:val="none" w:color="FFFFFF" w:sz="0"/>
+              <w:left w:val="none" w:color="FFFFFF" w:sz="0"/>
+              <w:bottom w:val="single" w:color="D6D6D6" w:sz="4"/>
+              <w:right w:val="none" w:color="FFFFFF" w:sz="0"/>
+            </w:tcBorders>
+            <w:tcMar>
+              <w:top w:type="dxa" w:w="60"/>
+              <w:left w:type="dxa" w:w="80"/>
+              <w:bottom w:type="dxa" w:w="60"/>
+              <w:right w:type="dxa" w:w="80"/>
+            </w:tcMar>
+          </w:tcPr>
+          <w:p>
+            <w:pPr>
+              <w:spacing w:after="0" w:line="250"/>
+            </w:pPr>
+            <w:r>
+              <w:rPr>
+                <w:rFonts w:ascii="Helvetica" w:cs="Helvetica" w:eastAsia="Helvetica" w:hAnsi="Helvetica"/>
+                <w:color w:val="1A1A1A"/>
+                <w:sz w:val="15"/>
+                <w:szCs w:val="15"/>
+              </w:rPr>
+              <w:t xml:space="preserve">ohne Zahl</w:t>
+            </w:r>
+          </w:p>
+        </w:tc>
+        <w:tc>
+          <w:tcPr>
+            <w:tcW w:type="dxa" w:w="1489"/>
+            <w:tcBorders>
+              <w:top w:val="none" w:color="FFFFFF" w:sz="0"/>
+              <w:left w:val="none" w:color="FFFFFF" w:sz="0"/>
+              <w:bottom w:val="single" w:color="D6D6D6" w:sz="4"/>
+              <w:right w:val="none" w:color="FFFFFF" w:sz="0"/>
+            </w:tcBorders>
+            <w:tcMar>
+              <w:top w:type="dxa" w:w="60"/>
+              <w:left w:type="dxa" w:w="80"/>
+              <w:bottom w:type="dxa" w:w="60"/>
+              <w:right w:type="dxa" w:w="80"/>
+            </w:tcMar>
+          </w:tcPr>
+          <w:p>
+            <w:pPr>
+              <w:spacing w:after="0" w:line="250"/>
+            </w:pPr>
+            <w:r>
+              <w:rPr>
+                <w:rFonts w:ascii="Helvetica" w:cs="Helvetica" w:eastAsia="Helvetica" w:hAnsi="Helvetica"/>
+                <w:color w:val="1A1A1A"/>
+                <w:sz w:val="15"/>
+                <w:szCs w:val="15"/>
+              </w:rPr>
+              <w:t xml:space="preserve">Massi</w:t>
+            </w:r>
+          </w:p>
+        </w:tc>
+      </w:tr>
+      <w:tr>
+        <w:trPr>
+          <w:cantSplit/>
+        </w:trPr>
+        <w:tc>
+          <w:tcPr>
+            <w:tcW w:type="dxa" w:w="3722"/>
+            <w:tcBorders>
+              <w:top w:val="none" w:color="FFFFFF" w:sz="0"/>
+              <w:left w:val="none" w:color="FFFFFF" w:sz="0"/>
+              <w:bottom w:val="single" w:color="D6D6D6" w:sz="4"/>
+              <w:right w:val="none" w:color="FFFFFF" w:sz="0"/>
+            </w:tcBorders>
+            <w:tcMar>
+              <w:top w:type="dxa" w:w="60"/>
+              <w:left w:type="dxa" w:w="80"/>
+              <w:bottom w:type="dxa" w:w="60"/>
+              <w:right w:type="dxa" w:w="80"/>
+            </w:tcMar>
+          </w:tcPr>
+          <w:p>
+            <w:pPr>
+              <w:spacing w:after="0" w:line="250"/>
+            </w:pPr>
+            <w:r>
+              <w:rPr>
+                <w:rFonts w:ascii="Helvetica" w:cs="Helvetica" w:eastAsia="Helvetica" w:hAnsi="Helvetica"/>
+                <w:color w:val="1A1A1A"/>
+                <w:sz w:val="15"/>
+                <w:szCs w:val="15"/>
+              </w:rPr>
+              <w:t xml:space="preserve">„Stark werben. Sauber formulieren.“</w:t>
+            </w:r>
+          </w:p>
+        </w:tc>
+        <w:tc>
+          <w:tcPr>
+            <w:tcW w:type="dxa" w:w="4095"/>
+            <w:tcBorders>
+              <w:top w:val="none" w:color="FFFFFF" w:sz="0"/>
+              <w:left w:val="none" w:color="FFFFFF" w:sz="0"/>
+              <w:bottom w:val="single" w:color="D6D6D6" w:sz="4"/>
+              <w:right w:val="none" w:color="FFFFFF" w:sz="0"/>
+            </w:tcBorders>
+            <w:tcMar>
+              <w:top w:type="dxa" w:w="60"/>
+              <w:left w:type="dxa" w:w="80"/>
+              <w:bottom w:type="dxa" w:w="60"/>
+              <w:right w:type="dxa" w:w="80"/>
+            </w:tcMar>
+          </w:tcPr>
+          <w:p>
+            <w:pPr>
+              <w:spacing w:after="0" w:line="250"/>
+            </w:pPr>
+            <w:r>
+              <w:rPr>
+                <w:rFonts w:ascii="Helvetica" w:cs="Helvetica" w:eastAsia="Helvetica" w:hAnsi="Helvetica"/>
+                <w:color w:val="1A1A1A"/>
+                <w:sz w:val="15"/>
+                <w:szCs w:val="15"/>
+              </w:rPr>
+              <w:t xml:space="preserve">„Stark werben. Ruhig veröffentlichen.“</w:t>
+            </w:r>
+          </w:p>
+        </w:tc>
+        <w:tc>
+          <w:tcPr>
+            <w:tcW w:type="dxa" w:w="1489"/>
+            <w:tcBorders>
+              <w:top w:val="none" w:color="FFFFFF" w:sz="0"/>
+              <w:left w:val="none" w:color="FFFFFF" w:sz="0"/>
+              <w:bottom w:val="single" w:color="D6D6D6" w:sz="4"/>
+              <w:right w:val="none" w:color="FFFFFF" w:sz="0"/>
+            </w:tcBorders>
+            <w:tcMar>
+              <w:top w:type="dxa" w:w="60"/>
+              <w:left w:type="dxa" w:w="80"/>
+              <w:bottom w:type="dxa" w:w="60"/>
+              <w:right w:type="dxa" w:w="80"/>
+            </w:tcMar>
+          </w:tcPr>
+          <w:p>
+            <w:pPr>
+              <w:spacing w:after="0" w:line="250"/>
+            </w:pPr>
+            <w:r>
+              <w:rPr>
+                <w:rFonts w:ascii="Helvetica" w:cs="Helvetica" w:eastAsia="Helvetica" w:hAnsi="Helvetica"/>
+                <w:color w:val="1A1A1A"/>
+                <w:sz w:val="15"/>
+                <w:szCs w:val="15"/>
+              </w:rPr>
+              <w:t xml:space="preserve">Massi</w:t>
+            </w:r>
+          </w:p>
+        </w:tc>
+      </w:tr>
+      <w:tr>
+        <w:trPr>
+          <w:cantSplit/>
+        </w:trPr>
+        <w:tc>
+          <w:tcPr>
+            <w:tcW w:type="dxa" w:w="3722"/>
+            <w:tcBorders>
+              <w:top w:val="none" w:color="FFFFFF" w:sz="0"/>
+              <w:left w:val="none" w:color="FFFFFF" w:sz="0"/>
+              <w:bottom w:val="single" w:color="D6D6D6" w:sz="4"/>
+              <w:right w:val="none" w:color="FFFFFF" w:sz="0"/>
+            </w:tcBorders>
+            <w:tcMar>
+              <w:top w:type="dxa" w:w="60"/>
+              <w:left w:type="dxa" w:w="80"/>
+              <w:bottom w:type="dxa" w:w="60"/>
+              <w:right w:type="dxa" w:w="80"/>
+            </w:tcMar>
+          </w:tcPr>
+          <w:p>
+            <w:pPr>
+              <w:spacing w:after="0" w:line="250"/>
+            </w:pPr>
+            <w:r>
+              <w:rPr>
+                <w:rFonts w:ascii="Helvetica" w:cs="Helvetica" w:eastAsia="Helvetica" w:hAnsi="Helvetica"/>
+                <w:color w:val="1A1A1A"/>
+                <w:sz w:val="15"/>
+                <w:szCs w:val="15"/>
+              </w:rPr>
+              <w:t xml:space="preserve">„Er stellt keine Rechtsberatung dar“</w:t>
+            </w:r>
+          </w:p>
+        </w:tc>
+        <w:tc>
+          <w:tcPr>
+            <w:tcW w:type="dxa" w:w="4095"/>
+            <w:tcBorders>
+              <w:top w:val="none" w:color="FFFFFF" w:sz="0"/>
+              <w:left w:val="none" w:color="FFFFFF" w:sz="0"/>
+              <w:bottom w:val="single" w:color="D6D6D6" w:sz="4"/>
+              <w:right w:val="none" w:color="FFFFFF" w:sz="0"/>
+            </w:tcBorders>
+            <w:tcMar>
+              <w:top w:type="dxa" w:w="60"/>
+              <w:left w:type="dxa" w:w="80"/>
+              <w:bottom w:type="dxa" w:w="60"/>
+              <w:right w:type="dxa" w:w="80"/>
+            </w:tcMar>
+          </w:tcPr>
+          <w:p>
+            <w:pPr>
+              <w:spacing w:after="0" w:line="250"/>
+            </w:pPr>
+            <w:r>
+              <w:rPr>
+                <w:rFonts w:ascii="Helvetica" w:cs="Helvetica" w:eastAsia="Helvetica" w:hAnsi="Helvetica"/>
+                <w:color w:val="1A1A1A"/>
+                <w:sz w:val="15"/>
+                <w:szCs w:val="15"/>
+              </w:rPr>
+              <w:t xml:space="preserve">„Den Einzelfall bewertet Ihre Kanzlei.“ (Entscheidung 3)</w:t>
+            </w:r>
+          </w:p>
+        </w:tc>
+        <w:tc>
+          <w:tcPr>
+            <w:tcW w:type="dxa" w:w="1489"/>
+            <w:tcBorders>
+              <w:top w:val="none" w:color="FFFFFF" w:sz="0"/>
+              <w:left w:val="none" w:color="FFFFFF" w:sz="0"/>
+              <w:bottom w:val="single" w:color="D6D6D6" w:sz="4"/>
+              <w:right w:val="none" w:color="FFFFFF" w:sz="0"/>
+            </w:tcBorders>
+            <w:tcMar>
+              <w:top w:type="dxa" w:w="60"/>
+              <w:left w:type="dxa" w:w="80"/>
+              <w:bottom w:type="dxa" w:w="60"/>
+              <w:right w:type="dxa" w:w="80"/>
+            </w:tcMar>
+          </w:tcPr>
+          <w:p>
+            <w:pPr>
+              <w:spacing w:after="0" w:line="250"/>
+            </w:pPr>
+            <w:r>
+              <w:rPr>
+                <w:rFonts w:ascii="Helvetica" w:cs="Helvetica" w:eastAsia="Helvetica" w:hAnsi="Helvetica"/>
+                <w:color w:val="1A1A1A"/>
+                <w:sz w:val="15"/>
+                <w:szCs w:val="15"/>
+              </w:rPr>
+              <w:t xml:space="preserve">Massi, Leon</w:t>
+            </w:r>
+          </w:p>
+        </w:tc>
+      </w:tr>
+      <w:tr>
+        <w:trPr>
+          <w:cantSplit/>
+        </w:trPr>
+        <w:tc>
+          <w:tcPr>
+            <w:tcW w:type="dxa" w:w="3722"/>
+            <w:tcBorders>
+              <w:top w:val="none" w:color="FFFFFF" w:sz="0"/>
+              <w:left w:val="none" w:color="FFFFFF" w:sz="0"/>
+              <w:bottom w:val="single" w:color="D6D6D6" w:sz="4"/>
+              <w:right w:val="none" w:color="FFFFFF" w:sz="0"/>
+            </w:tcBorders>
+            <w:tcMar>
+              <w:top w:type="dxa" w:w="60"/>
+              <w:left w:type="dxa" w:w="80"/>
+              <w:bottom w:type="dxa" w:w="60"/>
+              <w:right w:type="dxa" w:w="80"/>
+            </w:tcMar>
+          </w:tcPr>
+          <w:p>
+            <w:pPr>
+              <w:spacing w:after="0" w:line="250"/>
+            </w:pPr>
+            <w:r>
+              <w:rPr>
+                <w:rFonts w:ascii="Helvetica" w:cs="Helvetica" w:eastAsia="Helvetica" w:hAnsi="Helvetica"/>
+                <w:color w:val="1A1A1A"/>
+                <w:sz w:val="15"/>
+                <w:szCs w:val="15"/>
+              </w:rPr>
+              <w:t xml:space="preserve">„HWG-Wächter“, „Compliance-Monitoring“</w:t>
+            </w:r>
+          </w:p>
+        </w:tc>
+        <w:tc>
+          <w:tcPr>
+            <w:tcW w:type="dxa" w:w="4095"/>
+            <w:tcBorders>
+              <w:top w:val="none" w:color="FFFFFF" w:sz="0"/>
+              <w:left w:val="none" w:color="FFFFFF" w:sz="0"/>
+              <w:bottom w:val="single" w:color="D6D6D6" w:sz="4"/>
+              <w:right w:val="none" w:color="FFFFFF" w:sz="0"/>
+            </w:tcBorders>
+            <w:tcMar>
+              <w:top w:type="dxa" w:w="60"/>
+              <w:left w:type="dxa" w:w="80"/>
+              <w:bottom w:type="dxa" w:w="60"/>
+              <w:right w:type="dxa" w:w="80"/>
+            </w:tcMar>
+          </w:tcPr>
+          <w:p>
+            <w:pPr>
+              <w:spacing w:after="0" w:line="250"/>
+            </w:pPr>
+            <w:r>
+              <w:rPr>
+                <w:rFonts w:ascii="Helvetica" w:cs="Helvetica" w:eastAsia="Helvetica" w:hAnsi="Helvetica"/>
+                <w:color w:val="1A1A1A"/>
+                <w:sz w:val="15"/>
+                <w:szCs w:val="15"/>
+              </w:rPr>
+              <w:t xml:space="preserve">„Laufende Website-Prüfung“ (Entscheidung 4)</w:t>
+            </w:r>
+          </w:p>
+        </w:tc>
+        <w:tc>
+          <w:tcPr>
+            <w:tcW w:type="dxa" w:w="1489"/>
+            <w:tcBorders>
+              <w:top w:val="none" w:color="FFFFFF" w:sz="0"/>
+              <w:left w:val="none" w:color="FFFFFF" w:sz="0"/>
+              <w:bottom w:val="single" w:color="D6D6D6" w:sz="4"/>
+              <w:right w:val="none" w:color="FFFFFF" w:sz="0"/>
+            </w:tcBorders>
+            <w:tcMar>
+              <w:top w:type="dxa" w:w="60"/>
+              <w:left w:type="dxa" w:w="80"/>
+              <w:bottom w:type="dxa" w:w="60"/>
+              <w:right w:type="dxa" w:w="80"/>
+            </w:tcMar>
+          </w:tcPr>
+          <w:p>
+            <w:pPr>
+              <w:spacing w:after="0" w:line="250"/>
+            </w:pPr>
+            <w:r>
+              <w:rPr>
+                <w:rFonts w:ascii="Helvetica" w:cs="Helvetica" w:eastAsia="Helvetica" w:hAnsi="Helvetica"/>
+                <w:color w:val="1A1A1A"/>
+                <w:sz w:val="15"/>
+                <w:szCs w:val="15"/>
+              </w:rPr>
+              <w:t xml:space="preserve">Massi</w:t>
+            </w:r>
+          </w:p>
+        </w:tc>
+      </w:tr>
+      <w:tr>
+        <w:trPr>
+          <w:cantSplit/>
+        </w:trPr>
+        <w:tc>
+          <w:tcPr>
+            <w:tcW w:type="dxa" w:w="3722"/>
+            <w:tcBorders>
+              <w:top w:val="none" w:color="FFFFFF" w:sz="0"/>
+              <w:left w:val="none" w:color="FFFFFF" w:sz="0"/>
+              <w:bottom w:val="single" w:color="D6D6D6" w:sz="4"/>
+              <w:right w:val="none" w:color="FFFFFF" w:sz="0"/>
+            </w:tcBorders>
+            <w:tcMar>
+              <w:top w:type="dxa" w:w="60"/>
+              <w:left w:type="dxa" w:w="80"/>
+              <w:bottom w:type="dxa" w:w="60"/>
+              <w:right w:type="dxa" w:w="80"/>
+            </w:tcMar>
+          </w:tcPr>
+          <w:p>
+            <w:pPr>
+              <w:spacing w:after="0" w:line="250"/>
+            </w:pPr>
+            <w:r>
+              <w:rPr>
+                <w:rFonts w:ascii="Helvetica" w:cs="Helvetica" w:eastAsia="Helvetica" w:hAnsi="Helvetica"/>
+                <w:color w:val="1A1A1A"/>
+                <w:sz w:val="15"/>
+                <w:szCs w:val="15"/>
+              </w:rPr>
+              <w:t xml:space="preserve">FinTech (Munich Startup), „technische Vorprüfung“ (LinkedIn)</w:t>
+            </w:r>
+          </w:p>
+        </w:tc>
+        <w:tc>
+          <w:tcPr>
+            <w:tcW w:type="dxa" w:w="4095"/>
+            <w:tcBorders>
+              <w:top w:val="none" w:color="FFFFFF" w:sz="0"/>
+              <w:left w:val="none" w:color="FFFFFF" w:sz="0"/>
+              <w:bottom w:val="single" w:color="D6D6D6" w:sz="4"/>
+              <w:right w:val="none" w:color="FFFFFF" w:sz="0"/>
+            </w:tcBorders>
+            <w:tcMar>
+              <w:top w:type="dxa" w:w="60"/>
+              <w:left w:type="dxa" w:w="80"/>
+              <w:bottom w:type="dxa" w:w="60"/>
+              <w:right w:type="dxa" w:w="80"/>
+            </w:tcMar>
+          </w:tcPr>
+          <w:p>
+            <w:pPr>
+              <w:spacing w:after="0" w:line="250"/>
+            </w:pPr>
+            <w:r>
+              <w:rPr>
+                <w:rFonts w:ascii="Helvetica" w:cs="Helvetica" w:eastAsia="Helvetica" w:hAnsi="Helvetica"/>
+                <w:color w:val="1A1A1A"/>
+                <w:sz w:val="15"/>
+                <w:szCs w:val="15"/>
+              </w:rPr>
+              <w:t xml:space="preserve">unsere Definition, überall wörtlich gleich</w:t>
+            </w:r>
+          </w:p>
+        </w:tc>
+        <w:tc>
+          <w:tcPr>
+            <w:tcW w:type="dxa" w:w="1489"/>
+            <w:tcBorders>
+              <w:top w:val="none" w:color="FFFFFF" w:sz="0"/>
+              <w:left w:val="none" w:color="FFFFFF" w:sz="0"/>
+              <w:bottom w:val="single" w:color="D6D6D6" w:sz="4"/>
+              <w:right w:val="none" w:color="FFFFFF" w:sz="0"/>
+            </w:tcBorders>
+            <w:tcMar>
+              <w:top w:type="dxa" w:w="60"/>
+              <w:left w:type="dxa" w:w="80"/>
+              <w:bottom w:type="dxa" w:w="60"/>
+              <w:right w:type="dxa" w:w="80"/>
+            </w:tcMar>
+          </w:tcPr>
+          <w:p>
+            <w:pPr>
+              <w:spacing w:after="0" w:line="250"/>
+            </w:pPr>
+            <w:r>
+              <w:rPr>
+                <w:rFonts w:ascii="Helvetica" w:cs="Helvetica" w:eastAsia="Helvetica" w:hAnsi="Helvetica"/>
+                <w:color w:val="1A1A1A"/>
+                <w:sz w:val="15"/>
+                <w:szCs w:val="15"/>
+              </w:rPr>
+              <w:t xml:space="preserve">Massi</w:t>
+            </w:r>
+          </w:p>
+        </w:tc>
+      </w:tr>
+    </w:tbl>
+    <w:p>
+      <w:pPr>
+        <w:spacing w:after="160"/>
+      </w:pPr>
     </w:p>
     <w:p>
       <w:pPr>
@@ -409,7 +1456,7 @@
         <w:keepNext/>
       </w:pPr>
       <w:r>
-        <w:t xml:space="preserve">Folie 5 · Was ich mache</w:t>
+        <w:t xml:space="preserve">Folie 5 · Was du machst</w:t>
       </w:r>
     </w:p>
     <w:p>
@@ -439,7 +1486,7 @@
           <w:sz w:val="17"/>
           <w:szCs w:val="17"/>
         </w:rPr>
-        <w:t xml:space="preserve"> Eine Stimme, richtige Inhalte, andere sprechen über uns.  ·  etwa 1,5 Minuten</w:t>
+        <w:t xml:space="preserve"> Technik und Preise. Sofort etwa 5 Stunden, dann etwa 4 Tage, dann etwa 5 Tage.  ·  etwa 2 Minuten</w:t>
       </w:r>
     </w:p>
     <w:p>
@@ -464,7 +1511,7 @@
           <w:sz w:val="20"/>
           <w:szCs w:val="20"/>
         </w:rPr>
-        <w:t xml:space="preserve"> LinkedIn und Munich Startup auf unsere Beschreibung umstellen. Dort steht noch FinTech, deshalb hält Gemini uns dafür. Den Text für „Über uns“ schreiben. Einen Fehler im Vorher-Nachher-Artikel korrigieren.</w:t>
+        <w:t xml:space="preserve"> Gemini und die anderen KI-Crawler hereinlassen. Die Login-Seite aus der Google-Suche nehmen. Titel und Texte im Kopf der Seiten bereinigen. Und die Preisseite: Alle Zahlen raus, die wir nicht belegen können. Für einen Prüf-Anbieter sind die ein echtes Risiko.</w:t>
       </w:r>
     </w:p>
     <w:p>
@@ -489,7 +1536,7 @@
           <w:sz w:val="20"/>
           <w:szCs w:val="20"/>
         </w:rPr>
-        <w:t xml:space="preserve"> Texte für die Startseite, vier neue Artikel, jeder mit LinkedIn-Beitrag. Profile bei OMR, Crunchbase und G2.</w:t>
+        <w:t xml:space="preserve"> Google sagen, wer wir sind, also Firma, Sitz, Gründer. Die Seite „Über uns“ einbauen. Die Blog-Vorlage verbessern. Und messen, woher jede Anmeldung kommt.</w:t>
       </w:r>
     </w:p>
     <w:p>
@@ -505,16 +1552,30 @@
           <w:sz w:val="20"/>
           <w:szCs w:val="20"/>
         </w:rPr>
-        <w:t xml:space="preserve">Idee:</w:t>
-      </w:r>
-      <w:r>
-        <w:rPr>
-          <w:rFonts w:ascii="Helvetica" w:cs="Helvetica" w:eastAsia="Helvetica" w:hAnsi="Helvetica"/>
-          <w:color w:val="1A1A1A"/>
-          <w:sz w:val="20"/>
-          <w:szCs w:val="20"/>
-        </w:rPr>
-        <w:t xml:space="preserve"> Agenturen, die über das Thema schreiben, als Partner gewinnen.</w:t>
+        <w:t xml:space="preserve">In 90 Tagen:</w:t>
+      </w:r>
+      <w:r>
+        <w:rPr>
+          <w:rFonts w:ascii="Helvetica" w:cs="Helvetica" w:eastAsia="Helvetica" w:hAnsi="Helvetica"/>
+          <w:color w:val="1A1A1A"/>
+          <w:sz w:val="20"/>
+          <w:szCs w:val="20"/>
+        </w:rPr>
+        <w:t xml:space="preserve"> eine Seite pro Zielgruppe und eine Vergleichsseite.</w:t>
+      </w:r>
+    </w:p>
+    <w:p>
+      <w:pPr>
+        <w:spacing w:after="110" w:line="310"/>
+      </w:pPr>
+      <w:r>
+        <w:rPr>
+          <w:rFonts w:ascii="Helvetica" w:cs="Helvetica" w:eastAsia="Helvetica" w:hAnsi="Helvetica"/>
+          <w:color w:val="1A1A1A"/>
+          <w:sz w:val="20"/>
+          <w:szCs w:val="20"/>
+        </w:rPr>
+        <w:t xml:space="preserve">Alles steht mit Erklärung in deinem Blatt.</w:t>
       </w:r>
     </w:p>
     <w:p>
@@ -523,7 +1584,7 @@
         <w:keepNext/>
       </w:pPr>
       <w:r>
-        <w:t xml:space="preserve">Folie 6 · Was wir heute entscheiden</w:t>
+        <w:t xml:space="preserve">Folie 6 · Was ich mache</w:t>
       </w:r>
     </w:p>
     <w:p>
@@ -553,7 +1614,7 @@
           <w:sz w:val="17"/>
           <w:szCs w:val="17"/>
         </w:rPr>
-        <w:t xml:space="preserve"> Fünf Entscheidungen.  ·  etwa 2,5 Minuten</w:t>
+        <w:t xml:space="preserve"> Eine Stimme, richtige Inhalte, andere sprechen über uns.  ·  etwa 1,5 Minuten</w:t>
       </w:r>
     </w:p>
     <w:p>
@@ -569,16 +1630,16 @@
           <w:sz w:val="20"/>
           <w:szCs w:val="20"/>
         </w:rPr>
-        <w:t xml:space="preserve">1. Gemini freigeben?</w:t>
-      </w:r>
-      <w:r>
-        <w:rPr>
-          <w:rFonts w:ascii="Helvetica" w:cs="Helvetica" w:eastAsia="Helvetica" w:hAnsi="Helvetica"/>
-          <w:color w:val="1A1A1A"/>
-          <w:sz w:val="20"/>
-          <w:szCs w:val="20"/>
-        </w:rPr>
-        <w:t xml:space="preserve"> Ja. Sonst nennt Gemini uns nicht.</w:t>
+        <w:t xml:space="preserve">Sofort:</w:t>
+      </w:r>
+      <w:r>
+        <w:rPr>
+          <w:rFonts w:ascii="Helvetica" w:cs="Helvetica" w:eastAsia="Helvetica" w:hAnsi="Helvetica"/>
+          <w:color w:val="1A1A1A"/>
+          <w:sz w:val="20"/>
+          <w:szCs w:val="20"/>
+        </w:rPr>
+        <w:t xml:space="preserve"> LinkedIn und Munich Startup auf unsere Beschreibung umstellen. Dort steht noch FinTech, deshalb hält Gemini uns dafür. Den Text für „Über uns“ schreiben. Einen Fehler im Vorher-Nachher-Artikel korrigieren.</w:t>
       </w:r>
     </w:p>
     <w:p>
@@ -594,16 +1655,16 @@
           <w:sz w:val="20"/>
           <w:szCs w:val="20"/>
         </w:rPr>
-        <w:t xml:space="preserve">2. Welche Preise zeigt die Website?</w:t>
-      </w:r>
-      <w:r>
-        <w:rPr>
-          <w:rFonts w:ascii="Helvetica" w:cs="Helvetica" w:eastAsia="Helvetica" w:hAnsi="Helvetica"/>
-          <w:color w:val="1A1A1A"/>
-          <w:sz w:val="20"/>
-          <w:szCs w:val="20"/>
-        </w:rPr>
-        <w:t xml:space="preserve"> Deine Entscheidung. Vorschlag: neue Preise mit dem Upgrade, unbelegte Zahlen sofort raus.</w:t>
+        <w:t xml:space="preserve">In 30 Tagen:</w:t>
+      </w:r>
+      <w:r>
+        <w:rPr>
+          <w:rFonts w:ascii="Helvetica" w:cs="Helvetica" w:eastAsia="Helvetica" w:hAnsi="Helvetica"/>
+          <w:color w:val="1A1A1A"/>
+          <w:sz w:val="20"/>
+          <w:szCs w:val="20"/>
+        </w:rPr>
+        <w:t xml:space="preserve"> Texte für die Startseite, vier neue Artikel, jeder mit LinkedIn-Beitrag. Profile bei OMR, Crunchbase und G2.</w:t>
       </w:r>
     </w:p>
     <w:p>
@@ -619,41 +1680,55 @@
           <w:sz w:val="20"/>
           <w:szCs w:val="20"/>
         </w:rPr>
-        <w:t xml:space="preserve">3. Den Satz „keine Rechtsberatung“ unter den Artikeln?</w:t>
-      </w:r>
-      <w:r>
-        <w:rPr>
-          <w:rFonts w:ascii="Helvetica" w:cs="Helvetica" w:eastAsia="Helvetica" w:hAnsi="Helvetica"/>
-          <w:color w:val="1A1A1A"/>
-          <w:sz w:val="20"/>
-          <w:szCs w:val="20"/>
-        </w:rPr>
-        <w:t xml:space="preserve"> Ersetzen durch: „Den Einzelfall bewertet Ihre Kanzlei.“</w:t>
-      </w:r>
-    </w:p>
-    <w:p>
-      <w:pPr>
-        <w:spacing w:after="110" w:line="310"/>
+        <w:t xml:space="preserve">Idee:</w:t>
+      </w:r>
+      <w:r>
+        <w:rPr>
+          <w:rFonts w:ascii="Helvetica" w:cs="Helvetica" w:eastAsia="Helvetica" w:hAnsi="Helvetica"/>
+          <w:color w:val="1A1A1A"/>
+          <w:sz w:val="20"/>
+          <w:szCs w:val="20"/>
+        </w:rPr>
+        <w:t xml:space="preserve"> Agenturen, die über das Thema schreiben, als Partner gewinnen.</w:t>
+      </w:r>
+    </w:p>
+    <w:p>
+      <w:pPr>
+        <w:pStyle w:val="Heading2"/>
+        <w:keepNext/>
+      </w:pPr>
+      <w:r>
+        <w:t xml:space="preserve">Folie 7 · Was wir heute entscheiden</w:t>
+      </w:r>
+    </w:p>
+    <w:p>
+      <w:pPr>
+        <w:spacing w:after="100"/>
+        <w:rPr>
+          <w:color w:val="6B6B6B"/>
+          <w:sz w:val="17"/>
+          <w:szCs w:val="17"/>
+        </w:rPr>
       </w:pPr>
       <w:r>
         <w:rPr>
           <w:rFonts w:ascii="Helvetica" w:cs="Helvetica" w:eastAsia="Helvetica" w:hAnsi="Helvetica"/>
           <w:b/>
           <w:bCs/>
-          <w:color w:val="1A1A1A"/>
-          <w:sz w:val="20"/>
-          <w:szCs w:val="20"/>
-        </w:rPr>
-        <w:t xml:space="preserve">4. Name für den Wächter auf der Website?</w:t>
-      </w:r>
-      <w:r>
-        <w:rPr>
-          <w:rFonts w:ascii="Helvetica" w:cs="Helvetica" w:eastAsia="Helvetica" w:hAnsi="Helvetica"/>
-          <w:color w:val="1A1A1A"/>
-          <w:sz w:val="20"/>
-          <w:szCs w:val="20"/>
-        </w:rPr>
-        <w:t xml:space="preserve"> „Laufende Website-Prüfung“. In der App bleibt es „Wächter“.</w:t>
+          <w:color w:val="6B6B6B"/>
+          <w:sz w:val="17"/>
+          <w:szCs w:val="17"/>
+        </w:rPr>
+        <w:t xml:space="preserve">Auf der Folie:</w:t>
+      </w:r>
+      <w:r>
+        <w:rPr>
+          <w:rFonts w:ascii="Helvetica" w:cs="Helvetica" w:eastAsia="Helvetica" w:hAnsi="Helvetica"/>
+          <w:color w:val="6B6B6B"/>
+          <w:sz w:val="17"/>
+          <w:szCs w:val="17"/>
+        </w:rPr>
+        <w:t xml:space="preserve"> Fünf Entscheidungen.  ·  etwa 2,5 Minuten</w:t>
       </w:r>
     </w:p>
     <w:p>
@@ -669,6 +1744,106 @@
           <w:sz w:val="20"/>
           <w:szCs w:val="20"/>
         </w:rPr>
+        <w:t xml:space="preserve">1. Gemini freigeben?</w:t>
+      </w:r>
+      <w:r>
+        <w:rPr>
+          <w:rFonts w:ascii="Helvetica" w:cs="Helvetica" w:eastAsia="Helvetica" w:hAnsi="Helvetica"/>
+          <w:color w:val="1A1A1A"/>
+          <w:sz w:val="20"/>
+          <w:szCs w:val="20"/>
+        </w:rPr>
+        <w:t xml:space="preserve"> Ja. Sonst nennt Gemini uns nicht.</w:t>
+      </w:r>
+    </w:p>
+    <w:p>
+      <w:pPr>
+        <w:spacing w:after="110" w:line="310"/>
+      </w:pPr>
+      <w:r>
+        <w:rPr>
+          <w:rFonts w:ascii="Helvetica" w:cs="Helvetica" w:eastAsia="Helvetica" w:hAnsi="Helvetica"/>
+          <w:b/>
+          <w:bCs/>
+          <w:color w:val="1A1A1A"/>
+          <w:sz w:val="20"/>
+          <w:szCs w:val="20"/>
+        </w:rPr>
+        <w:t xml:space="preserve">2. Welche Preise zeigt die Website?</w:t>
+      </w:r>
+      <w:r>
+        <w:rPr>
+          <w:rFonts w:ascii="Helvetica" w:cs="Helvetica" w:eastAsia="Helvetica" w:hAnsi="Helvetica"/>
+          <w:color w:val="1A1A1A"/>
+          <w:sz w:val="20"/>
+          <w:szCs w:val="20"/>
+        </w:rPr>
+        <w:t xml:space="preserve"> Deine Entscheidung. Vorschlag: neue Preise mit dem Upgrade, unbelegte Zahlen sofort raus.</w:t>
+      </w:r>
+    </w:p>
+    <w:p>
+      <w:pPr>
+        <w:spacing w:after="110" w:line="310"/>
+      </w:pPr>
+      <w:r>
+        <w:rPr>
+          <w:rFonts w:ascii="Helvetica" w:cs="Helvetica" w:eastAsia="Helvetica" w:hAnsi="Helvetica"/>
+          <w:b/>
+          <w:bCs/>
+          <w:color w:val="1A1A1A"/>
+          <w:sz w:val="20"/>
+          <w:szCs w:val="20"/>
+        </w:rPr>
+        <w:t xml:space="preserve">3. Den Satz „keine Rechtsberatung“ unter den Artikeln?</w:t>
+      </w:r>
+      <w:r>
+        <w:rPr>
+          <w:rFonts w:ascii="Helvetica" w:cs="Helvetica" w:eastAsia="Helvetica" w:hAnsi="Helvetica"/>
+          <w:color w:val="1A1A1A"/>
+          <w:sz w:val="20"/>
+          <w:szCs w:val="20"/>
+        </w:rPr>
+        <w:t xml:space="preserve"> Ersetzen durch: „Den Einzelfall bewertet Ihre Kanzlei.“</w:t>
+      </w:r>
+    </w:p>
+    <w:p>
+      <w:pPr>
+        <w:spacing w:after="110" w:line="310"/>
+      </w:pPr>
+      <w:r>
+        <w:rPr>
+          <w:rFonts w:ascii="Helvetica" w:cs="Helvetica" w:eastAsia="Helvetica" w:hAnsi="Helvetica"/>
+          <w:b/>
+          <w:bCs/>
+          <w:color w:val="1A1A1A"/>
+          <w:sz w:val="20"/>
+          <w:szCs w:val="20"/>
+        </w:rPr>
+        <w:t xml:space="preserve">4. Name für den Wächter auf der Website?</w:t>
+      </w:r>
+      <w:r>
+        <w:rPr>
+          <w:rFonts w:ascii="Helvetica" w:cs="Helvetica" w:eastAsia="Helvetica" w:hAnsi="Helvetica"/>
+          <w:color w:val="1A1A1A"/>
+          <w:sz w:val="20"/>
+          <w:szCs w:val="20"/>
+        </w:rPr>
+        <w:t xml:space="preserve"> „Laufende Website-Prüfung“. In der App bleibt es „Wächter“.</w:t>
+      </w:r>
+    </w:p>
+    <w:p>
+      <w:pPr>
+        <w:spacing w:after="110" w:line="310"/>
+      </w:pPr>
+      <w:r>
+        <w:rPr>
+          <w:rFonts w:ascii="Helvetica" w:cs="Helvetica" w:eastAsia="Helvetica" w:hAnsi="Helvetica"/>
+          <w:b/>
+          <w:bCs/>
+          <w:color w:val="1A1A1A"/>
+          <w:sz w:val="20"/>
+          <w:szCs w:val="20"/>
+        </w:rPr>
         <w:t xml:space="preserve">5. Die KI-Modelle mit unseren Texten lernen lassen?</w:t>
       </w:r>
       <w:r>
@@ -701,7 +1876,7 @@
         <w:keepNext/>
       </w:pPr>
       <w:r>
-        <w:t xml:space="preserve">Folie 7 · Was es bringt und wie es weitergeht</w:t>
+        <w:t xml:space="preserve">Folie 8 · Was es bringt und wie es weitergeht</w:t>
       </w:r>
     </w:p>
     <w:p>

</xml_diff>